<commit_message>
modified Vacation Planner Application Documentation and VacationReportScreen.kt
</commit_message>
<xml_diff>
--- a/documentation/Vacation Planner Application.docx
+++ b/documentation/Vacation Planner Application.docx
@@ -3932,7 +3932,19 @@
           <w:rPr>
             <w:rStyle w:val="Hyperlink"/>
           </w:rPr>
-          <w:t>WGU GitLab Environment / Student Repos / jgonz270 / D424 Software Engineering Capstone · GitLab</w:t>
+          <w:t>https://gi</w:t>
+        </w:r>
+        <w:r>
+          <w:rPr>
+            <w:rStyle w:val="Hyperlink"/>
+          </w:rPr>
+          <w:t>t</w:t>
+        </w:r>
+        <w:r>
+          <w:rPr>
+            <w:rStyle w:val="Hyperlink"/>
+          </w:rPr>
+          <w:t>lab.com/wgu-gitlab-environment/student-repos/jgonz270/d424-software-engineering-capstone/-/tree/working_branch?ref_type=heads</w:t>
         </w:r>
       </w:hyperlink>
     </w:p>
@@ -4166,6 +4178,7 @@
         </w:numPr>
       </w:pPr>
       <w:r>
+        <w:lastRenderedPageBreak/>
         <w:t>Enable USB Debugging</w:t>
       </w:r>
     </w:p>
@@ -4178,7 +4191,6 @@
         </w:numPr>
       </w:pPr>
       <w:r>
-        <w:lastRenderedPageBreak/>
         <w:t>Connect device via USB</w:t>
       </w:r>
     </w:p>

</xml_diff>

<commit_message>
Fixed Vacation Planner Application.docx not saved
</commit_message>
<xml_diff>
--- a/documentation/Vacation Planner Application.docx
+++ b/documentation/Vacation Planner Application.docx
@@ -3932,19 +3932,7 @@
           <w:rPr>
             <w:rStyle w:val="Hyperlink"/>
           </w:rPr>
-          <w:t>https://gi</w:t>
-        </w:r>
-        <w:r>
-          <w:rPr>
-            <w:rStyle w:val="Hyperlink"/>
-          </w:rPr>
-          <w:t>t</w:t>
-        </w:r>
-        <w:r>
-          <w:rPr>
-            <w:rStyle w:val="Hyperlink"/>
-          </w:rPr>
-          <w:t>lab.com/wgu-gitlab-environment/student-repos/jgonz270/d424-software-engineering-capstone/-/tree/working_branch?ref_type=heads</w:t>
+          <w:t>https://gitlab.com/wgu-gitlab-environment/student-repos/jgonz270/d424-software-engineering-capstone/-/tree/working_branch?ref_type=heads</w:t>
         </w:r>
       </w:hyperlink>
     </w:p>
@@ -4160,13 +4148,8 @@
           <w:numId w:val="7"/>
         </w:numPr>
       </w:pPr>
-      <w:proofErr w:type="gramStart"/>
-      <w:r>
-        <w:t>Enable</w:t>
-      </w:r>
-      <w:proofErr w:type="gramEnd"/>
-      <w:r>
-        <w:t xml:space="preserve"> Developer Options</w:t>
+      <w:r>
+        <w:t>Enable Developer Options</w:t>
       </w:r>
     </w:p>
     <w:p>
@@ -4375,18 +4358,13 @@
       </w:r>
       <w:proofErr w:type="spellEnd"/>
       <w:r>
-        <w:t xml:space="preserve"> and </w:t>
-      </w:r>
-      <w:proofErr w:type="gramStart"/>
-      <w:r>
-        <w:t xml:space="preserve">a </w:t>
+        <w:t xml:space="preserve"> and a </w:t>
       </w:r>
       <w:proofErr w:type="spellStart"/>
       <w:r>
         <w:t>BroadcastReceiver</w:t>
       </w:r>
       <w:proofErr w:type="spellEnd"/>
-      <w:proofErr w:type="gramEnd"/>
       <w:r>
         <w:t>. If alerts do not appear, ensure notification permission is granted.</w:t>
       </w:r>
@@ -4472,13 +4450,8 @@
     </w:p>
     <w:p>
       <w:r>
-        <w:t xml:space="preserve">If app won’t </w:t>
-      </w:r>
-      <w:proofErr w:type="gramStart"/>
-      <w:r>
-        <w:t>build</w:t>
-      </w:r>
-      <w:proofErr w:type="gramEnd"/>
+        <w:t>If app won’t build</w:t>
+      </w:r>
       <w:r>
         <w:t xml:space="preserve"> try the following:</w:t>
       </w:r>
@@ -5274,15 +5247,7 @@
         </w:numPr>
       </w:pPr>
       <w:r>
-        <w:t xml:space="preserve">Excursions: list of excursions </w:t>
-      </w:r>
-      <w:proofErr w:type="gramStart"/>
-      <w:r>
-        <w:t>with</w:t>
-      </w:r>
-      <w:proofErr w:type="gramEnd"/>
-      <w:r>
-        <w:t xml:space="preserve"> their cost</w:t>
+        <w:t>Excursions: list of excursions with their cost</w:t>
       </w:r>
     </w:p>
     <w:p>
@@ -5302,6 +5267,18 @@
     </w:p>
     <w:p>
       <w:pPr>
+        <w:pStyle w:val="ListParagraph"/>
+        <w:numPr>
+          <w:ilvl w:val="0"/>
+          <w:numId w:val="28"/>
+        </w:numPr>
+      </w:pPr>
+      <w:r>
+        <w:t xml:space="preserve">User can share the report by clicking the </w:t>
+      </w:r>
+    </w:p>
+    <w:p>
+      <w:pPr>
         <w:pStyle w:val="Heading3"/>
       </w:pPr>
       <w:bookmarkStart w:id="26" w:name="_Toc233372509"/>
@@ -5463,6 +5440,7 @@
     </w:p>
     <w:p>
       <w:r>
+        <w:lastRenderedPageBreak/>
         <w:t>This will show the summary of the vacation including its excursions</w:t>
       </w:r>
     </w:p>
@@ -5472,7 +5450,6 @@
       </w:pPr>
       <w:bookmarkStart w:id="28" w:name="_Toc233372511"/>
       <w:r>
-        <w:lastRenderedPageBreak/>
         <w:t>Excursions</w:t>
       </w:r>
       <w:r>
@@ -5672,17 +5649,12 @@
         <w:t xml:space="preserve">Query using </w:t>
       </w:r>
       <w:proofErr w:type="spellStart"/>
-      <w:proofErr w:type="gramStart"/>
       <w:r>
         <w:t>getAll</w:t>
       </w:r>
       <w:proofErr w:type="spellEnd"/>
       <w:r>
-        <w:t>(</w:t>
-      </w:r>
-      <w:proofErr w:type="gramEnd"/>
-      <w:r>
-        <w:t>)</w:t>
+        <w:t>()</w:t>
       </w:r>
     </w:p>
     <w:p>
@@ -5921,17 +5893,12 @@
         <w:t xml:space="preserve">Query using </w:t>
       </w:r>
       <w:proofErr w:type="spellStart"/>
-      <w:proofErr w:type="gramStart"/>
       <w:r>
         <w:t>getAll</w:t>
       </w:r>
       <w:proofErr w:type="spellEnd"/>
       <w:r>
-        <w:t>(</w:t>
-      </w:r>
-      <w:proofErr w:type="gramEnd"/>
-      <w:r>
-        <w:t>)</w:t>
+        <w:t>()</w:t>
       </w:r>
     </w:p>
     <w:p>
@@ -6116,17 +6083,12 @@
         <w:t xml:space="preserve">Query excursions for that vacation using </w:t>
       </w:r>
       <w:proofErr w:type="spellStart"/>
-      <w:proofErr w:type="gramStart"/>
       <w:r>
         <w:t>getExcursionsByVacationId</w:t>
       </w:r>
       <w:proofErr w:type="spellEnd"/>
       <w:r>
-        <w:t>(</w:t>
-      </w:r>
-      <w:proofErr w:type="gramEnd"/>
-      <w:r>
-        <w:t>).</w:t>
+        <w:t>().</w:t>
       </w:r>
     </w:p>
     <w:p>
@@ -6295,15 +6257,7 @@
         <w:t xml:space="preserve">Purpose: Verify that </w:t>
       </w:r>
       <w:r>
-        <w:t xml:space="preserve">all properties in the Trip Financial Summary </w:t>
-      </w:r>
-      <w:proofErr w:type="gramStart"/>
-      <w:r>
-        <w:t>is</w:t>
-      </w:r>
-      <w:proofErr w:type="gramEnd"/>
-      <w:r>
-        <w:t xml:space="preserve"> correctly calculated.</w:t>
+        <w:t>all properties in the Trip Financial Summary is correctly calculated.</w:t>
       </w:r>
     </w:p>
     <w:p>
@@ -6567,16 +6521,8 @@
         <w:rPr>
           <w:rFonts w:cs="Courier New"/>
         </w:rPr>
-        <w:t xml:space="preserve">    </w:t>
-      </w:r>
-      <w:proofErr w:type="gramStart"/>
-      <w:r>
-        <w:rPr>
-          <w:rFonts w:cs="Courier New"/>
-        </w:rPr>
-        <w:t>@Before</w:t>
-      </w:r>
-      <w:proofErr w:type="gramEnd"/>
+        <w:t xml:space="preserve">    @Before</w:t>
+      </w:r>
     </w:p>
     <w:p>
       <w:pPr>
@@ -6595,21 +6541,7 @@
         <w:rPr>
           <w:rFonts w:cs="Courier New"/>
         </w:rPr>
-        <w:t xml:space="preserve">    fun </w:t>
-      </w:r>
-      <w:proofErr w:type="gramStart"/>
-      <w:r>
-        <w:rPr>
-          <w:rFonts w:cs="Courier New"/>
-        </w:rPr>
-        <w:t>setup(</w:t>
-      </w:r>
-      <w:proofErr w:type="gramEnd"/>
-      <w:r>
-        <w:rPr>
-          <w:rFonts w:cs="Courier New"/>
-        </w:rPr>
-        <w:t>) {</w:t>
+        <w:t xml:space="preserve">    fun setup() {</w:t>
       </w:r>
     </w:p>
     <w:p>
@@ -6714,7 +6646,6 @@
         <w:t xml:space="preserve">            </w:t>
       </w:r>
       <w:proofErr w:type="spellStart"/>
-      <w:proofErr w:type="gramStart"/>
       <w:r>
         <w:rPr>
           <w:rFonts w:cs="Courier New"/>
@@ -6726,14 +6657,7 @@
         <w:rPr>
           <w:rFonts w:cs="Courier New"/>
         </w:rPr>
-        <w:t>::</w:t>
-      </w:r>
-      <w:proofErr w:type="gramEnd"/>
-      <w:r>
-        <w:rPr>
-          <w:rFonts w:cs="Courier New"/>
-        </w:rPr>
-        <w:t>class.java</w:t>
+        <w:t>::class.java</w:t>
       </w:r>
     </w:p>
     <w:p>
@@ -6753,14 +6677,7 @@
         <w:rPr>
           <w:rFonts w:cs="Courier New"/>
         </w:rPr>
-        <w:t xml:space="preserve">        </w:t>
-      </w:r>
-      <w:proofErr w:type="gramStart"/>
-      <w:r>
-        <w:rPr>
-          <w:rFonts w:cs="Courier New"/>
-        </w:rPr>
-        <w:t>).</w:t>
+        <w:t xml:space="preserve">        ).</w:t>
       </w:r>
       <w:proofErr w:type="spellStart"/>
       <w:r>
@@ -6770,26 +6687,11 @@
         <w:t>allowMainThreadQueries</w:t>
       </w:r>
       <w:proofErr w:type="spellEnd"/>
-      <w:proofErr w:type="gramEnd"/>
       <w:r>
         <w:rPr>
           <w:rFonts w:cs="Courier New"/>
         </w:rPr>
-        <w:t>(</w:t>
-      </w:r>
-      <w:proofErr w:type="gramStart"/>
-      <w:r>
-        <w:rPr>
-          <w:rFonts w:cs="Courier New"/>
-        </w:rPr>
-        <w:t>).build</w:t>
-      </w:r>
-      <w:proofErr w:type="gramEnd"/>
-      <w:r>
-        <w:rPr>
-          <w:rFonts w:cs="Courier New"/>
-        </w:rPr>
-        <w:t>()</w:t>
+        <w:t>().build()</w:t>
       </w:r>
     </w:p>
     <w:p>
@@ -6812,7 +6714,6 @@
         <w:t xml:space="preserve">        dao = </w:t>
       </w:r>
       <w:proofErr w:type="spellStart"/>
-      <w:proofErr w:type="gramStart"/>
       <w:r>
         <w:rPr>
           <w:rFonts w:cs="Courier New"/>
@@ -6820,7 +6721,6 @@
         <w:t>db.vacationDao</w:t>
       </w:r>
       <w:proofErr w:type="spellEnd"/>
-      <w:proofErr w:type="gramEnd"/>
       <w:r>
         <w:rPr>
           <w:rFonts w:cs="Courier New"/>
@@ -6899,21 +6799,7 @@
         <w:rPr>
           <w:rFonts w:cs="Courier New"/>
         </w:rPr>
-        <w:t xml:space="preserve">    fun </w:t>
-      </w:r>
-      <w:proofErr w:type="gramStart"/>
-      <w:r>
-        <w:rPr>
-          <w:rFonts w:cs="Courier New"/>
-        </w:rPr>
-        <w:t>teardown(</w:t>
-      </w:r>
-      <w:proofErr w:type="gramEnd"/>
-      <w:r>
-        <w:rPr>
-          <w:rFonts w:cs="Courier New"/>
-        </w:rPr>
-        <w:t>) {</w:t>
+        <w:t xml:space="preserve">    fun teardown() {</w:t>
       </w:r>
     </w:p>
     <w:p>
@@ -6936,7 +6822,6 @@
         <w:t xml:space="preserve">        </w:t>
       </w:r>
       <w:proofErr w:type="spellStart"/>
-      <w:proofErr w:type="gramStart"/>
       <w:r>
         <w:rPr>
           <w:rFonts w:cs="Courier New"/>
@@ -6944,7 +6829,6 @@
         <w:t>db.close</w:t>
       </w:r>
       <w:proofErr w:type="spellEnd"/>
-      <w:proofErr w:type="gramEnd"/>
       <w:r>
         <w:rPr>
           <w:rFonts w:cs="Courier New"/>
@@ -7003,16 +6887,8 @@
         <w:rPr>
           <w:rFonts w:cs="Courier New"/>
         </w:rPr>
-        <w:t xml:space="preserve">    </w:t>
-      </w:r>
-      <w:proofErr w:type="gramStart"/>
-      <w:r>
-        <w:rPr>
-          <w:rFonts w:cs="Courier New"/>
-        </w:rPr>
-        <w:t>@Test</w:t>
-      </w:r>
-      <w:proofErr w:type="gramEnd"/>
+        <w:t xml:space="preserve">    @Test</w:t>
+      </w:r>
     </w:p>
     <w:p>
       <w:pPr>
@@ -7038,28 +6914,14 @@
         <w:rPr>
           <w:rFonts w:cs="Courier New"/>
         </w:rPr>
-        <w:t>insertVacation_</w:t>
-      </w:r>
-      <w:proofErr w:type="gramStart"/>
+        <w:t>insertVacation_savesCorrectly</w:t>
+      </w:r>
+      <w:proofErr w:type="spellEnd"/>
       <w:r>
         <w:rPr>
           <w:rFonts w:cs="Courier New"/>
         </w:rPr>
-        <w:t>savesCorrectly</w:t>
-      </w:r>
-      <w:proofErr w:type="spellEnd"/>
-      <w:r>
-        <w:rPr>
-          <w:rFonts w:cs="Courier New"/>
-        </w:rPr>
-        <w:t>(</w:t>
-      </w:r>
-      <w:proofErr w:type="gramEnd"/>
-      <w:r>
-        <w:rPr>
-          <w:rFonts w:cs="Courier New"/>
-        </w:rPr>
-        <w:t xml:space="preserve">) = </w:t>
+        <w:t xml:space="preserve">() = </w:t>
       </w:r>
       <w:proofErr w:type="spellStart"/>
       <w:r>
@@ -7107,16 +6969,8 @@
         <w:rPr>
           <w:rFonts w:cs="Courier New"/>
         </w:rPr>
-        <w:t xml:space="preserve"> vacation = </w:t>
-      </w:r>
-      <w:proofErr w:type="gramStart"/>
-      <w:r>
-        <w:rPr>
-          <w:rFonts w:cs="Courier New"/>
-        </w:rPr>
-        <w:t>Vacation(</w:t>
-      </w:r>
-      <w:proofErr w:type="gramEnd"/>
+        <w:t xml:space="preserve"> vacation = Vacation(</w:t>
+      </w:r>
     </w:p>
     <w:p>
       <w:pPr>
@@ -7335,7 +7189,6 @@
         <w:t xml:space="preserve"> = </w:t>
       </w:r>
       <w:proofErr w:type="spellStart"/>
-      <w:proofErr w:type="gramStart"/>
       <w:r>
         <w:rPr>
           <w:rFonts w:cs="Courier New"/>
@@ -7347,14 +7200,7 @@
         <w:rPr>
           <w:rFonts w:cs="Courier New"/>
         </w:rPr>
-        <w:t>(</w:t>
-      </w:r>
-      <w:proofErr w:type="gramEnd"/>
-      <w:r>
-        <w:rPr>
-          <w:rFonts w:cs="Courier New"/>
-        </w:rPr>
-        <w:t>1,3,5),</w:t>
+        <w:t>(1,3,5),</w:t>
       </w:r>
     </w:p>
     <w:p>
@@ -7445,7 +7291,6 @@
         <w:t xml:space="preserve">        </w:t>
       </w:r>
       <w:proofErr w:type="spellStart"/>
-      <w:proofErr w:type="gramStart"/>
       <w:r>
         <w:rPr>
           <w:rFonts w:cs="Courier New"/>
@@ -7453,7 +7298,6 @@
         <w:t>dao.insert</w:t>
       </w:r>
       <w:proofErr w:type="spellEnd"/>
-      <w:proofErr w:type="gramEnd"/>
       <w:r>
         <w:rPr>
           <w:rFonts w:cs="Courier New"/>
@@ -7495,7 +7339,6 @@
         <w:t xml:space="preserve"> result = </w:t>
       </w:r>
       <w:proofErr w:type="spellStart"/>
-      <w:proofErr w:type="gramStart"/>
       <w:r>
         <w:rPr>
           <w:rFonts w:cs="Courier New"/>
@@ -7503,26 +7346,11 @@
         <w:t>dao.getAll</w:t>
       </w:r>
       <w:proofErr w:type="spellEnd"/>
-      <w:proofErr w:type="gramEnd"/>
       <w:r>
         <w:rPr>
           <w:rFonts w:cs="Courier New"/>
         </w:rPr>
-        <w:t>(</w:t>
-      </w:r>
-      <w:proofErr w:type="gramStart"/>
-      <w:r>
-        <w:rPr>
-          <w:rFonts w:cs="Courier New"/>
-        </w:rPr>
-        <w:t>).first</w:t>
-      </w:r>
-      <w:proofErr w:type="gramEnd"/>
-      <w:r>
-        <w:rPr>
-          <w:rFonts w:cs="Courier New"/>
-        </w:rPr>
-        <w:t>()</w:t>
+        <w:t>().first()</w:t>
       </w:r>
     </w:p>
     <w:p>
@@ -7573,7 +7401,6 @@
         <w:t>(</w:t>
       </w:r>
       <w:proofErr w:type="spellStart"/>
-      <w:proofErr w:type="gramStart"/>
       <w:r>
         <w:rPr>
           <w:rFonts w:cs="Courier New"/>
@@ -7581,7 +7408,6 @@
         <w:t>result.isNotEmpty</w:t>
       </w:r>
       <w:proofErr w:type="spellEnd"/>
-      <w:proofErr w:type="gramEnd"/>
       <w:r>
         <w:rPr>
           <w:rFonts w:cs="Courier New"/>
@@ -7609,7 +7435,6 @@
         <w:t xml:space="preserve">        </w:t>
       </w:r>
       <w:proofErr w:type="spellStart"/>
-      <w:proofErr w:type="gramStart"/>
       <w:r>
         <w:rPr>
           <w:rFonts w:cs="Courier New"/>
@@ -7621,28 +7446,7 @@
         <w:rPr>
           <w:rFonts w:cs="Courier New"/>
         </w:rPr>
-        <w:t>(</w:t>
-      </w:r>
-      <w:proofErr w:type="gramEnd"/>
-      <w:r>
-        <w:rPr>
-          <w:rFonts w:cs="Courier New"/>
-        </w:rPr>
-        <w:t>"Test Trip", result[0</w:t>
-      </w:r>
-      <w:proofErr w:type="gramStart"/>
-      <w:r>
-        <w:rPr>
-          <w:rFonts w:cs="Courier New"/>
-        </w:rPr>
-        <w:t>].title</w:t>
-      </w:r>
-      <w:proofErr w:type="gramEnd"/>
-      <w:r>
-        <w:rPr>
-          <w:rFonts w:cs="Courier New"/>
-        </w:rPr>
-        <w:t>)</w:t>
+        <w:t>("Test Trip", result[0].title)</w:t>
       </w:r>
     </w:p>
     <w:p>
@@ -10100,29 +9904,13 @@
       </w:pPr>
       <w:bookmarkStart w:id="49" w:name="_Toc233372532"/>
       <w:r>
-        <w:t xml:space="preserve">Summary of Changes </w:t>
-      </w:r>
-      <w:proofErr w:type="gramStart"/>
-      <w:r>
-        <w:t>From</w:t>
-      </w:r>
-      <w:proofErr w:type="gramEnd"/>
-      <w:r>
-        <w:t xml:space="preserve"> Testing</w:t>
+        <w:t>Summary of Changes From Testing</w:t>
       </w:r>
       <w:bookmarkEnd w:id="49"/>
     </w:p>
     <w:p>
       <w:r>
-        <w:t xml:space="preserve">All five tests passed successfully on the first execution. No code changes were required </w:t>
-      </w:r>
-      <w:proofErr w:type="gramStart"/>
-      <w:r>
-        <w:t>as a result of</w:t>
-      </w:r>
-      <w:proofErr w:type="gramEnd"/>
-      <w:r>
-        <w:t xml:space="preserve"> testing. The tests confirmed that:</w:t>
+        <w:t>All five tests passed successfully on the first execution. No code changes were required as a result of testing. The tests confirmed that:</w:t>
       </w:r>
     </w:p>
     <w:p>

</xml_diff>

<commit_message>
modified Vacation Planner Application.docx
</commit_message>
<xml_diff>
--- a/documentation/Vacation Planner Application.docx
+++ b/documentation/Vacation Planner Application.docx
@@ -87,7 +87,7 @@
           <w:r>
             <w:fldChar w:fldCharType="separate"/>
           </w:r>
-          <w:hyperlink w:anchor="_Toc233372483" w:history="1">
+          <w:hyperlink w:anchor="_Toc233652690" w:history="1">
             <w:r>
               <w:rPr>
                 <w:rStyle w:val="Hyperlink"/>
@@ -114,7 +114,7 @@
                 <w:noProof/>
                 <w:webHidden/>
               </w:rPr>
-              <w:instrText xml:space="preserve"> PAGEREF _Toc233372483 \h </w:instrText>
+              <w:instrText xml:space="preserve"> PAGEREF _Toc233652690 \h </w:instrText>
             </w:r>
             <w:r>
               <w:rPr>
@@ -156,7 +156,7 @@
               <w:noProof/>
             </w:rPr>
           </w:pPr>
-          <w:hyperlink w:anchor="_Toc233372484" w:history="1">
+          <w:hyperlink w:anchor="_Toc233652691" w:history="1">
             <w:r>
               <w:rPr>
                 <w:rStyle w:val="Hyperlink"/>
@@ -183,7 +183,7 @@
                 <w:noProof/>
                 <w:webHidden/>
               </w:rPr>
-              <w:instrText xml:space="preserve"> PAGEREF _Toc233372484 \h </w:instrText>
+              <w:instrText xml:space="preserve"> PAGEREF _Toc233652691 \h </w:instrText>
             </w:r>
             <w:r>
               <w:rPr>
@@ -225,7 +225,7 @@
               <w:noProof/>
             </w:rPr>
           </w:pPr>
-          <w:hyperlink w:anchor="_Toc233372485" w:history="1">
+          <w:hyperlink w:anchor="_Toc233652692" w:history="1">
             <w:r>
               <w:rPr>
                 <w:rStyle w:val="Hyperlink"/>
@@ -252,7 +252,7 @@
                 <w:noProof/>
                 <w:webHidden/>
               </w:rPr>
-              <w:instrText xml:space="preserve"> PAGEREF _Toc233372485 \h </w:instrText>
+              <w:instrText xml:space="preserve"> PAGEREF _Toc233652692 \h </w:instrText>
             </w:r>
             <w:r>
               <w:rPr>
@@ -294,7 +294,7 @@
               <w:noProof/>
             </w:rPr>
           </w:pPr>
-          <w:hyperlink w:anchor="_Toc233372486" w:history="1">
+          <w:hyperlink w:anchor="_Toc233652693" w:history="1">
             <w:r>
               <w:rPr>
                 <w:rStyle w:val="Hyperlink"/>
@@ -321,7 +321,7 @@
                 <w:noProof/>
                 <w:webHidden/>
               </w:rPr>
-              <w:instrText xml:space="preserve"> PAGEREF _Toc233372486 \h </w:instrText>
+              <w:instrText xml:space="preserve"> PAGEREF _Toc233652693 \h </w:instrText>
             </w:r>
             <w:r>
               <w:rPr>
@@ -363,7 +363,7 @@
               <w:noProof/>
             </w:rPr>
           </w:pPr>
-          <w:hyperlink w:anchor="_Toc233372487" w:history="1">
+          <w:hyperlink w:anchor="_Toc233652694" w:history="1">
             <w:r>
               <w:rPr>
                 <w:rStyle w:val="Hyperlink"/>
@@ -390,7 +390,7 @@
                 <w:noProof/>
                 <w:webHidden/>
               </w:rPr>
-              <w:instrText xml:space="preserve"> PAGEREF _Toc233372487 \h </w:instrText>
+              <w:instrText xml:space="preserve"> PAGEREF _Toc233652694 \h </w:instrText>
             </w:r>
             <w:r>
               <w:rPr>
@@ -432,7 +432,7 @@
               <w:noProof/>
             </w:rPr>
           </w:pPr>
-          <w:hyperlink w:anchor="_Toc233372488" w:history="1">
+          <w:hyperlink w:anchor="_Toc233652695" w:history="1">
             <w:r>
               <w:rPr>
                 <w:rStyle w:val="Hyperlink"/>
@@ -459,7 +459,7 @@
                 <w:noProof/>
                 <w:webHidden/>
               </w:rPr>
-              <w:instrText xml:space="preserve"> PAGEREF _Toc233372488 \h </w:instrText>
+              <w:instrText xml:space="preserve"> PAGEREF _Toc233652695 \h </w:instrText>
             </w:r>
             <w:r>
               <w:rPr>
@@ -501,7 +501,7 @@
               <w:noProof/>
             </w:rPr>
           </w:pPr>
-          <w:hyperlink w:anchor="_Toc233372489" w:history="1">
+          <w:hyperlink w:anchor="_Toc233652696" w:history="1">
             <w:r>
               <w:rPr>
                 <w:rStyle w:val="Hyperlink"/>
@@ -528,7 +528,7 @@
                 <w:noProof/>
                 <w:webHidden/>
               </w:rPr>
-              <w:instrText xml:space="preserve"> PAGEREF _Toc233372489 \h </w:instrText>
+              <w:instrText xml:space="preserve"> PAGEREF _Toc233652696 \h </w:instrText>
             </w:r>
             <w:r>
               <w:rPr>
@@ -570,7 +570,7 @@
               <w:noProof/>
             </w:rPr>
           </w:pPr>
-          <w:hyperlink w:anchor="_Toc233372490" w:history="1">
+          <w:hyperlink w:anchor="_Toc233652697" w:history="1">
             <w:r>
               <w:rPr>
                 <w:rStyle w:val="Hyperlink"/>
@@ -597,7 +597,7 @@
                 <w:noProof/>
                 <w:webHidden/>
               </w:rPr>
-              <w:instrText xml:space="preserve"> PAGEREF _Toc233372490 \h </w:instrText>
+              <w:instrText xml:space="preserve"> PAGEREF _Toc233652697 \h </w:instrText>
             </w:r>
             <w:r>
               <w:rPr>
@@ -639,7 +639,7 @@
               <w:noProof/>
             </w:rPr>
           </w:pPr>
-          <w:hyperlink w:anchor="_Toc233372491" w:history="1">
+          <w:hyperlink w:anchor="_Toc233652698" w:history="1">
             <w:r>
               <w:rPr>
                 <w:rStyle w:val="Hyperlink"/>
@@ -666,7 +666,7 @@
                 <w:noProof/>
                 <w:webHidden/>
               </w:rPr>
-              <w:instrText xml:space="preserve"> PAGEREF _Toc233372491 \h </w:instrText>
+              <w:instrText xml:space="preserve"> PAGEREF _Toc233652698 \h </w:instrText>
             </w:r>
             <w:r>
               <w:rPr>
@@ -708,7 +708,7 @@
               <w:noProof/>
             </w:rPr>
           </w:pPr>
-          <w:hyperlink w:anchor="_Toc233372492" w:history="1">
+          <w:hyperlink w:anchor="_Toc233652699" w:history="1">
             <w:r>
               <w:rPr>
                 <w:rStyle w:val="Hyperlink"/>
@@ -735,7 +735,7 @@
                 <w:noProof/>
                 <w:webHidden/>
               </w:rPr>
-              <w:instrText xml:space="preserve"> PAGEREF _Toc233372492 \h </w:instrText>
+              <w:instrText xml:space="preserve"> PAGEREF _Toc233652699 \h </w:instrText>
             </w:r>
             <w:r>
               <w:rPr>
@@ -777,7 +777,7 @@
               <w:noProof/>
             </w:rPr>
           </w:pPr>
-          <w:hyperlink w:anchor="_Toc233372493" w:history="1">
+          <w:hyperlink w:anchor="_Toc233652700" w:history="1">
             <w:r>
               <w:rPr>
                 <w:rStyle w:val="Hyperlink"/>
@@ -804,7 +804,7 @@
                 <w:noProof/>
                 <w:webHidden/>
               </w:rPr>
-              <w:instrText xml:space="preserve"> PAGEREF _Toc233372493 \h </w:instrText>
+              <w:instrText xml:space="preserve"> PAGEREF _Toc233652700 \h </w:instrText>
             </w:r>
             <w:r>
               <w:rPr>
@@ -846,7 +846,7 @@
               <w:noProof/>
             </w:rPr>
           </w:pPr>
-          <w:hyperlink w:anchor="_Toc233372494" w:history="1">
+          <w:hyperlink w:anchor="_Toc233652701" w:history="1">
             <w:r>
               <w:rPr>
                 <w:rStyle w:val="Hyperlink"/>
@@ -873,7 +873,7 @@
                 <w:noProof/>
                 <w:webHidden/>
               </w:rPr>
-              <w:instrText xml:space="preserve"> PAGEREF _Toc233372494 \h </w:instrText>
+              <w:instrText xml:space="preserve"> PAGEREF _Toc233652701 \h </w:instrText>
             </w:r>
             <w:r>
               <w:rPr>
@@ -915,7 +915,7 @@
               <w:noProof/>
             </w:rPr>
           </w:pPr>
-          <w:hyperlink w:anchor="_Toc233372495" w:history="1">
+          <w:hyperlink w:anchor="_Toc233652702" w:history="1">
             <w:r>
               <w:rPr>
                 <w:rStyle w:val="Hyperlink"/>
@@ -942,7 +942,7 @@
                 <w:noProof/>
                 <w:webHidden/>
               </w:rPr>
-              <w:instrText xml:space="preserve"> PAGEREF _Toc233372495 \h </w:instrText>
+              <w:instrText xml:space="preserve"> PAGEREF _Toc233652702 \h </w:instrText>
             </w:r>
             <w:r>
               <w:rPr>
@@ -984,7 +984,7 @@
               <w:noProof/>
             </w:rPr>
           </w:pPr>
-          <w:hyperlink w:anchor="_Toc233372496" w:history="1">
+          <w:hyperlink w:anchor="_Toc233652703" w:history="1">
             <w:r>
               <w:rPr>
                 <w:rStyle w:val="Hyperlink"/>
@@ -1011,7 +1011,7 @@
                 <w:noProof/>
                 <w:webHidden/>
               </w:rPr>
-              <w:instrText xml:space="preserve"> PAGEREF _Toc233372496 \h </w:instrText>
+              <w:instrText xml:space="preserve"> PAGEREF _Toc233652703 \h </w:instrText>
             </w:r>
             <w:r>
               <w:rPr>
@@ -1053,7 +1053,7 @@
               <w:noProof/>
             </w:rPr>
           </w:pPr>
-          <w:hyperlink w:anchor="_Toc233372497" w:history="1">
+          <w:hyperlink w:anchor="_Toc233652704" w:history="1">
             <w:r>
               <w:rPr>
                 <w:rStyle w:val="Hyperlink"/>
@@ -1080,7 +1080,7 @@
                 <w:noProof/>
                 <w:webHidden/>
               </w:rPr>
-              <w:instrText xml:space="preserve"> PAGEREF _Toc233372497 \h </w:instrText>
+              <w:instrText xml:space="preserve"> PAGEREF _Toc233652704 \h </w:instrText>
             </w:r>
             <w:r>
               <w:rPr>
@@ -1122,7 +1122,7 @@
               <w:noProof/>
             </w:rPr>
           </w:pPr>
-          <w:hyperlink w:anchor="_Toc233372498" w:history="1">
+          <w:hyperlink w:anchor="_Toc233652705" w:history="1">
             <w:r>
               <w:rPr>
                 <w:rStyle w:val="Hyperlink"/>
@@ -1149,7 +1149,7 @@
                 <w:noProof/>
                 <w:webHidden/>
               </w:rPr>
-              <w:instrText xml:space="preserve"> PAGEREF _Toc233372498 \h </w:instrText>
+              <w:instrText xml:space="preserve"> PAGEREF _Toc233652705 \h </w:instrText>
             </w:r>
             <w:r>
               <w:rPr>
@@ -1191,7 +1191,7 @@
               <w:noProof/>
             </w:rPr>
           </w:pPr>
-          <w:hyperlink w:anchor="_Toc233372499" w:history="1">
+          <w:hyperlink w:anchor="_Toc233652706" w:history="1">
             <w:r>
               <w:rPr>
                 <w:rStyle w:val="Hyperlink"/>
@@ -1218,7 +1218,7 @@
                 <w:noProof/>
                 <w:webHidden/>
               </w:rPr>
-              <w:instrText xml:space="preserve"> PAGEREF _Toc233372499 \h </w:instrText>
+              <w:instrText xml:space="preserve"> PAGEREF _Toc233652706 \h </w:instrText>
             </w:r>
             <w:r>
               <w:rPr>
@@ -1260,7 +1260,7 @@
               <w:noProof/>
             </w:rPr>
           </w:pPr>
-          <w:hyperlink w:anchor="_Toc233372500" w:history="1">
+          <w:hyperlink w:anchor="_Toc233652707" w:history="1">
             <w:r>
               <w:rPr>
                 <w:rStyle w:val="Hyperlink"/>
@@ -1287,7 +1287,7 @@
                 <w:noProof/>
                 <w:webHidden/>
               </w:rPr>
-              <w:instrText xml:space="preserve"> PAGEREF _Toc233372500 \h </w:instrText>
+              <w:instrText xml:space="preserve"> PAGEREF _Toc233652707 \h </w:instrText>
             </w:r>
             <w:r>
               <w:rPr>
@@ -1329,7 +1329,7 @@
               <w:noProof/>
             </w:rPr>
           </w:pPr>
-          <w:hyperlink w:anchor="_Toc233372501" w:history="1">
+          <w:hyperlink w:anchor="_Toc233652708" w:history="1">
             <w:r>
               <w:rPr>
                 <w:rStyle w:val="Hyperlink"/>
@@ -1356,7 +1356,7 @@
                 <w:noProof/>
                 <w:webHidden/>
               </w:rPr>
-              <w:instrText xml:space="preserve"> PAGEREF _Toc233372501 \h </w:instrText>
+              <w:instrText xml:space="preserve"> PAGEREF _Toc233652708 \h </w:instrText>
             </w:r>
             <w:r>
               <w:rPr>
@@ -1398,7 +1398,7 @@
               <w:noProof/>
             </w:rPr>
           </w:pPr>
-          <w:hyperlink w:anchor="_Toc233372502" w:history="1">
+          <w:hyperlink w:anchor="_Toc233652709" w:history="1">
             <w:r>
               <w:rPr>
                 <w:rStyle w:val="Hyperlink"/>
@@ -1425,7 +1425,7 @@
                 <w:noProof/>
                 <w:webHidden/>
               </w:rPr>
-              <w:instrText xml:space="preserve"> PAGEREF _Toc233372502 \h </w:instrText>
+              <w:instrText xml:space="preserve"> PAGEREF _Toc233652709 \h </w:instrText>
             </w:r>
             <w:r>
               <w:rPr>
@@ -1467,7 +1467,7 @@
               <w:noProof/>
             </w:rPr>
           </w:pPr>
-          <w:hyperlink w:anchor="_Toc233372503" w:history="1">
+          <w:hyperlink w:anchor="_Toc233652710" w:history="1">
             <w:r>
               <w:rPr>
                 <w:rStyle w:val="Hyperlink"/>
@@ -1494,7 +1494,7 @@
                 <w:noProof/>
                 <w:webHidden/>
               </w:rPr>
-              <w:instrText xml:space="preserve"> PAGEREF _Toc233372503 \h </w:instrText>
+              <w:instrText xml:space="preserve"> PAGEREF _Toc233652710 \h </w:instrText>
             </w:r>
             <w:r>
               <w:rPr>
@@ -1536,7 +1536,7 @@
               <w:noProof/>
             </w:rPr>
           </w:pPr>
-          <w:hyperlink w:anchor="_Toc233372504" w:history="1">
+          <w:hyperlink w:anchor="_Toc233652711" w:history="1">
             <w:r>
               <w:rPr>
                 <w:rStyle w:val="Hyperlink"/>
@@ -1563,7 +1563,7 @@
                 <w:noProof/>
                 <w:webHidden/>
               </w:rPr>
-              <w:instrText xml:space="preserve"> PAGEREF _Toc233372504 \h </w:instrText>
+              <w:instrText xml:space="preserve"> PAGEREF _Toc233652711 \h </w:instrText>
             </w:r>
             <w:r>
               <w:rPr>
@@ -1605,7 +1605,7 @@
               <w:noProof/>
             </w:rPr>
           </w:pPr>
-          <w:hyperlink w:anchor="_Toc233372505" w:history="1">
+          <w:hyperlink w:anchor="_Toc233652712" w:history="1">
             <w:r>
               <w:rPr>
                 <w:rStyle w:val="Hyperlink"/>
@@ -1632,7 +1632,7 @@
                 <w:noProof/>
                 <w:webHidden/>
               </w:rPr>
-              <w:instrText xml:space="preserve"> PAGEREF _Toc233372505 \h </w:instrText>
+              <w:instrText xml:space="preserve"> PAGEREF _Toc233652712 \h </w:instrText>
             </w:r>
             <w:r>
               <w:rPr>
@@ -1674,7 +1674,7 @@
               <w:noProof/>
             </w:rPr>
           </w:pPr>
-          <w:hyperlink w:anchor="_Toc233372506" w:history="1">
+          <w:hyperlink w:anchor="_Toc233652713" w:history="1">
             <w:r>
               <w:rPr>
                 <w:rStyle w:val="Hyperlink"/>
@@ -1701,7 +1701,7 @@
                 <w:noProof/>
                 <w:webHidden/>
               </w:rPr>
-              <w:instrText xml:space="preserve"> PAGEREF _Toc233372506 \h </w:instrText>
+              <w:instrText xml:space="preserve"> PAGEREF _Toc233652713 \h </w:instrText>
             </w:r>
             <w:r>
               <w:rPr>
@@ -1743,7 +1743,7 @@
               <w:noProof/>
             </w:rPr>
           </w:pPr>
-          <w:hyperlink w:anchor="_Toc233372507" w:history="1">
+          <w:hyperlink w:anchor="_Toc233652714" w:history="1">
             <w:r>
               <w:rPr>
                 <w:rStyle w:val="Hyperlink"/>
@@ -1770,7 +1770,7 @@
                 <w:noProof/>
                 <w:webHidden/>
               </w:rPr>
-              <w:instrText xml:space="preserve"> PAGEREF _Toc233372507 \h </w:instrText>
+              <w:instrText xml:space="preserve"> PAGEREF _Toc233652714 \h </w:instrText>
             </w:r>
             <w:r>
               <w:rPr>
@@ -1812,7 +1812,7 @@
               <w:noProof/>
             </w:rPr>
           </w:pPr>
-          <w:hyperlink w:anchor="_Toc233372508" w:history="1">
+          <w:hyperlink w:anchor="_Toc233652715" w:history="1">
             <w:r>
               <w:rPr>
                 <w:rStyle w:val="Hyperlink"/>
@@ -1839,7 +1839,7 @@
                 <w:noProof/>
                 <w:webHidden/>
               </w:rPr>
-              <w:instrText xml:space="preserve"> PAGEREF _Toc233372508 \h </w:instrText>
+              <w:instrText xml:space="preserve"> PAGEREF _Toc233652715 \h </w:instrText>
             </w:r>
             <w:r>
               <w:rPr>
@@ -1881,7 +1881,7 @@
               <w:noProof/>
             </w:rPr>
           </w:pPr>
-          <w:hyperlink w:anchor="_Toc233372509" w:history="1">
+          <w:hyperlink w:anchor="_Toc233652716" w:history="1">
             <w:r>
               <w:rPr>
                 <w:rStyle w:val="Hyperlink"/>
@@ -1908,7 +1908,7 @@
                 <w:noProof/>
                 <w:webHidden/>
               </w:rPr>
-              <w:instrText xml:space="preserve"> PAGEREF _Toc233372509 \h </w:instrText>
+              <w:instrText xml:space="preserve"> PAGEREF _Toc233652716 \h </w:instrText>
             </w:r>
             <w:r>
               <w:rPr>
@@ -1950,7 +1950,7 @@
               <w:noProof/>
             </w:rPr>
           </w:pPr>
-          <w:hyperlink w:anchor="_Toc233372510" w:history="1">
+          <w:hyperlink w:anchor="_Toc233652717" w:history="1">
             <w:r>
               <w:rPr>
                 <w:rStyle w:val="Hyperlink"/>
@@ -1977,7 +1977,7 @@
                 <w:noProof/>
                 <w:webHidden/>
               </w:rPr>
-              <w:instrText xml:space="preserve"> PAGEREF _Toc233372510 \h </w:instrText>
+              <w:instrText xml:space="preserve"> PAGEREF _Toc233652717 \h </w:instrText>
             </w:r>
             <w:r>
               <w:rPr>
@@ -2019,7 +2019,7 @@
               <w:noProof/>
             </w:rPr>
           </w:pPr>
-          <w:hyperlink w:anchor="_Toc233372511" w:history="1">
+          <w:hyperlink w:anchor="_Toc233652718" w:history="1">
             <w:r>
               <w:rPr>
                 <w:rStyle w:val="Hyperlink"/>
@@ -2046,7 +2046,7 @@
                 <w:noProof/>
                 <w:webHidden/>
               </w:rPr>
-              <w:instrText xml:space="preserve"> PAGEREF _Toc233372511 \h </w:instrText>
+              <w:instrText xml:space="preserve"> PAGEREF _Toc233652718 \h </w:instrText>
             </w:r>
             <w:r>
               <w:rPr>
@@ -2088,7 +2088,7 @@
               <w:noProof/>
             </w:rPr>
           </w:pPr>
-          <w:hyperlink w:anchor="_Toc233372512" w:history="1">
+          <w:hyperlink w:anchor="_Toc233652719" w:history="1">
             <w:r>
               <w:rPr>
                 <w:rStyle w:val="Hyperlink"/>
@@ -2115,7 +2115,7 @@
                 <w:noProof/>
                 <w:webHidden/>
               </w:rPr>
-              <w:instrText xml:space="preserve"> PAGEREF _Toc233372512 \h </w:instrText>
+              <w:instrText xml:space="preserve"> PAGEREF _Toc233652719 \h </w:instrText>
             </w:r>
             <w:r>
               <w:rPr>
@@ -2157,7 +2157,7 @@
               <w:noProof/>
             </w:rPr>
           </w:pPr>
-          <w:hyperlink w:anchor="_Toc233372513" w:history="1">
+          <w:hyperlink w:anchor="_Toc233652720" w:history="1">
             <w:r>
               <w:rPr>
                 <w:rStyle w:val="Hyperlink"/>
@@ -2184,7 +2184,7 @@
                 <w:noProof/>
                 <w:webHidden/>
               </w:rPr>
-              <w:instrText xml:space="preserve"> PAGEREF _Toc233372513 \h </w:instrText>
+              <w:instrText xml:space="preserve"> PAGEREF _Toc233652720 \h </w:instrText>
             </w:r>
             <w:r>
               <w:rPr>
@@ -2226,7 +2226,7 @@
               <w:noProof/>
             </w:rPr>
           </w:pPr>
-          <w:hyperlink w:anchor="_Toc233372514" w:history="1">
+          <w:hyperlink w:anchor="_Toc233652721" w:history="1">
             <w:r>
               <w:rPr>
                 <w:rStyle w:val="Hyperlink"/>
@@ -2253,7 +2253,7 @@
                 <w:noProof/>
                 <w:webHidden/>
               </w:rPr>
-              <w:instrText xml:space="preserve"> PAGEREF _Toc233372514 \h </w:instrText>
+              <w:instrText xml:space="preserve"> PAGEREF _Toc233652721 \h </w:instrText>
             </w:r>
             <w:r>
               <w:rPr>
@@ -2295,7 +2295,7 @@
               <w:noProof/>
             </w:rPr>
           </w:pPr>
-          <w:hyperlink w:anchor="_Toc233372515" w:history="1">
+          <w:hyperlink w:anchor="_Toc233652722" w:history="1">
             <w:r>
               <w:rPr>
                 <w:rStyle w:val="Hyperlink"/>
@@ -2322,7 +2322,7 @@
                 <w:noProof/>
                 <w:webHidden/>
               </w:rPr>
-              <w:instrText xml:space="preserve"> PAGEREF _Toc233372515 \h </w:instrText>
+              <w:instrText xml:space="preserve"> PAGEREF _Toc233652722 \h </w:instrText>
             </w:r>
             <w:r>
               <w:rPr>
@@ -2364,7 +2364,7 @@
               <w:noProof/>
             </w:rPr>
           </w:pPr>
-          <w:hyperlink w:anchor="_Toc233372516" w:history="1">
+          <w:hyperlink w:anchor="_Toc233652723" w:history="1">
             <w:r>
               <w:rPr>
                 <w:rStyle w:val="Hyperlink"/>
@@ -2391,7 +2391,7 @@
                 <w:noProof/>
                 <w:webHidden/>
               </w:rPr>
-              <w:instrText xml:space="preserve"> PAGEREF _Toc233372516 \h </w:instrText>
+              <w:instrText xml:space="preserve"> PAGEREF _Toc233652723 \h </w:instrText>
             </w:r>
             <w:r>
               <w:rPr>
@@ -2433,7 +2433,7 @@
               <w:noProof/>
             </w:rPr>
           </w:pPr>
-          <w:hyperlink w:anchor="_Toc233372517" w:history="1">
+          <w:hyperlink w:anchor="_Toc233652724" w:history="1">
             <w:r>
               <w:rPr>
                 <w:rStyle w:val="Hyperlink"/>
@@ -2460,7 +2460,7 @@
                 <w:noProof/>
                 <w:webHidden/>
               </w:rPr>
-              <w:instrText xml:space="preserve"> PAGEREF _Toc233372517 \h </w:instrText>
+              <w:instrText xml:space="preserve"> PAGEREF _Toc233652724 \h </w:instrText>
             </w:r>
             <w:r>
               <w:rPr>
@@ -2502,7 +2502,7 @@
               <w:noProof/>
             </w:rPr>
           </w:pPr>
-          <w:hyperlink w:anchor="_Toc233372518" w:history="1">
+          <w:hyperlink w:anchor="_Toc233652725" w:history="1">
             <w:r>
               <w:rPr>
                 <w:rStyle w:val="Hyperlink"/>
@@ -2529,7 +2529,7 @@
                 <w:noProof/>
                 <w:webHidden/>
               </w:rPr>
-              <w:instrText xml:space="preserve"> PAGEREF _Toc233372518 \h </w:instrText>
+              <w:instrText xml:space="preserve"> PAGEREF _Toc233652725 \h </w:instrText>
             </w:r>
             <w:r>
               <w:rPr>
@@ -2571,7 +2571,7 @@
               <w:noProof/>
             </w:rPr>
           </w:pPr>
-          <w:hyperlink w:anchor="_Toc233372519" w:history="1">
+          <w:hyperlink w:anchor="_Toc233652726" w:history="1">
             <w:r>
               <w:rPr>
                 <w:rStyle w:val="Hyperlink"/>
@@ -2598,7 +2598,7 @@
                 <w:noProof/>
                 <w:webHidden/>
               </w:rPr>
-              <w:instrText xml:space="preserve"> PAGEREF _Toc233372519 \h </w:instrText>
+              <w:instrText xml:space="preserve"> PAGEREF _Toc233652726 \h </w:instrText>
             </w:r>
             <w:r>
               <w:rPr>
@@ -2640,7 +2640,7 @@
               <w:noProof/>
             </w:rPr>
           </w:pPr>
-          <w:hyperlink w:anchor="_Toc233372520" w:history="1">
+          <w:hyperlink w:anchor="_Toc233652727" w:history="1">
             <w:r>
               <w:rPr>
                 <w:rStyle w:val="Hyperlink"/>
@@ -2667,7 +2667,7 @@
                 <w:noProof/>
                 <w:webHidden/>
               </w:rPr>
-              <w:instrText xml:space="preserve"> PAGEREF _Toc233372520 \h </w:instrText>
+              <w:instrText xml:space="preserve"> PAGEREF _Toc233652727 \h </w:instrText>
             </w:r>
             <w:r>
               <w:rPr>
@@ -2709,7 +2709,7 @@
               <w:noProof/>
             </w:rPr>
           </w:pPr>
-          <w:hyperlink w:anchor="_Toc233372521" w:history="1">
+          <w:hyperlink w:anchor="_Toc233652728" w:history="1">
             <w:r>
               <w:rPr>
                 <w:rStyle w:val="Hyperlink"/>
@@ -2736,7 +2736,7 @@
                 <w:noProof/>
                 <w:webHidden/>
               </w:rPr>
-              <w:instrText xml:space="preserve"> PAGEREF _Toc233372521 \h </w:instrText>
+              <w:instrText xml:space="preserve"> PAGEREF _Toc233652728 \h </w:instrText>
             </w:r>
             <w:r>
               <w:rPr>
@@ -2778,7 +2778,7 @@
               <w:noProof/>
             </w:rPr>
           </w:pPr>
-          <w:hyperlink w:anchor="_Toc233372522" w:history="1">
+          <w:hyperlink w:anchor="_Toc233652729" w:history="1">
             <w:r>
               <w:rPr>
                 <w:rStyle w:val="Hyperlink"/>
@@ -2805,7 +2805,7 @@
                 <w:noProof/>
                 <w:webHidden/>
               </w:rPr>
-              <w:instrText xml:space="preserve"> PAGEREF _Toc233372522 \h </w:instrText>
+              <w:instrText xml:space="preserve"> PAGEREF _Toc233652729 \h </w:instrText>
             </w:r>
             <w:r>
               <w:rPr>
@@ -2847,7 +2847,7 @@
               <w:noProof/>
             </w:rPr>
           </w:pPr>
-          <w:hyperlink w:anchor="_Toc233372523" w:history="1">
+          <w:hyperlink w:anchor="_Toc233652730" w:history="1">
             <w:r>
               <w:rPr>
                 <w:rStyle w:val="Hyperlink"/>
@@ -2874,7 +2874,7 @@
                 <w:noProof/>
                 <w:webHidden/>
               </w:rPr>
-              <w:instrText xml:space="preserve"> PAGEREF _Toc233372523 \h </w:instrText>
+              <w:instrText xml:space="preserve"> PAGEREF _Toc233652730 \h </w:instrText>
             </w:r>
             <w:r>
               <w:rPr>
@@ -2916,7 +2916,7 @@
               <w:noProof/>
             </w:rPr>
           </w:pPr>
-          <w:hyperlink w:anchor="_Toc233372524" w:history="1">
+          <w:hyperlink w:anchor="_Toc233652731" w:history="1">
             <w:r>
               <w:rPr>
                 <w:rStyle w:val="Hyperlink"/>
@@ -2943,7 +2943,7 @@
                 <w:noProof/>
                 <w:webHidden/>
               </w:rPr>
-              <w:instrText xml:space="preserve"> PAGEREF _Toc233372524 \h </w:instrText>
+              <w:instrText xml:space="preserve"> PAGEREF _Toc233652731 \h </w:instrText>
             </w:r>
             <w:r>
               <w:rPr>
@@ -2985,7 +2985,7 @@
               <w:noProof/>
             </w:rPr>
           </w:pPr>
-          <w:hyperlink w:anchor="_Toc233372525" w:history="1">
+          <w:hyperlink w:anchor="_Toc233652732" w:history="1">
             <w:r>
               <w:rPr>
                 <w:rStyle w:val="Hyperlink"/>
@@ -3012,7 +3012,7 @@
                 <w:noProof/>
                 <w:webHidden/>
               </w:rPr>
-              <w:instrText xml:space="preserve"> PAGEREF _Toc233372525 \h </w:instrText>
+              <w:instrText xml:space="preserve"> PAGEREF _Toc233652732 \h </w:instrText>
             </w:r>
             <w:r>
               <w:rPr>
@@ -3054,7 +3054,7 @@
               <w:noProof/>
             </w:rPr>
           </w:pPr>
-          <w:hyperlink w:anchor="_Toc233372526" w:history="1">
+          <w:hyperlink w:anchor="_Toc233652733" w:history="1">
             <w:r>
               <w:rPr>
                 <w:rStyle w:val="Hyperlink"/>
@@ -3081,7 +3081,7 @@
                 <w:noProof/>
                 <w:webHidden/>
               </w:rPr>
-              <w:instrText xml:space="preserve"> PAGEREF _Toc233372526 \h </w:instrText>
+              <w:instrText xml:space="preserve"> PAGEREF _Toc233652733 \h </w:instrText>
             </w:r>
             <w:r>
               <w:rPr>
@@ -3123,7 +3123,7 @@
               <w:noProof/>
             </w:rPr>
           </w:pPr>
-          <w:hyperlink w:anchor="_Toc233372527" w:history="1">
+          <w:hyperlink w:anchor="_Toc233652734" w:history="1">
             <w:r>
               <w:rPr>
                 <w:rStyle w:val="Hyperlink"/>
@@ -3150,7 +3150,7 @@
                 <w:noProof/>
                 <w:webHidden/>
               </w:rPr>
-              <w:instrText xml:space="preserve"> PAGEREF _Toc233372527 \h </w:instrText>
+              <w:instrText xml:space="preserve"> PAGEREF _Toc233652734 \h </w:instrText>
             </w:r>
             <w:r>
               <w:rPr>
@@ -3192,7 +3192,7 @@
               <w:noProof/>
             </w:rPr>
           </w:pPr>
-          <w:hyperlink w:anchor="_Toc233372528" w:history="1">
+          <w:hyperlink w:anchor="_Toc233652735" w:history="1">
             <w:r>
               <w:rPr>
                 <w:rStyle w:val="Hyperlink"/>
@@ -3219,7 +3219,7 @@
                 <w:noProof/>
                 <w:webHidden/>
               </w:rPr>
-              <w:instrText xml:space="preserve"> PAGEREF _Toc233372528 \h </w:instrText>
+              <w:instrText xml:space="preserve"> PAGEREF _Toc233652735 \h </w:instrText>
             </w:r>
             <w:r>
               <w:rPr>
@@ -3261,7 +3261,7 @@
               <w:noProof/>
             </w:rPr>
           </w:pPr>
-          <w:hyperlink w:anchor="_Toc233372529" w:history="1">
+          <w:hyperlink w:anchor="_Toc233652736" w:history="1">
             <w:r>
               <w:rPr>
                 <w:rStyle w:val="Hyperlink"/>
@@ -3288,7 +3288,7 @@
                 <w:noProof/>
                 <w:webHidden/>
               </w:rPr>
-              <w:instrText xml:space="preserve"> PAGEREF _Toc233372529 \h </w:instrText>
+              <w:instrText xml:space="preserve"> PAGEREF _Toc233652736 \h </w:instrText>
             </w:r>
             <w:r>
               <w:rPr>
@@ -3330,7 +3330,7 @@
               <w:noProof/>
             </w:rPr>
           </w:pPr>
-          <w:hyperlink w:anchor="_Toc233372530" w:history="1">
+          <w:hyperlink w:anchor="_Toc233652737" w:history="1">
             <w:r>
               <w:rPr>
                 <w:rStyle w:val="Hyperlink"/>
@@ -3357,7 +3357,7 @@
                 <w:noProof/>
                 <w:webHidden/>
               </w:rPr>
-              <w:instrText xml:space="preserve"> PAGEREF _Toc233372530 \h </w:instrText>
+              <w:instrText xml:space="preserve"> PAGEREF _Toc233652737 \h </w:instrText>
             </w:r>
             <w:r>
               <w:rPr>
@@ -3399,7 +3399,7 @@
               <w:noProof/>
             </w:rPr>
           </w:pPr>
-          <w:hyperlink w:anchor="_Toc233372531" w:history="1">
+          <w:hyperlink w:anchor="_Toc233652738" w:history="1">
             <w:r>
               <w:rPr>
                 <w:rStyle w:val="Hyperlink"/>
@@ -3426,7 +3426,7 @@
                 <w:noProof/>
                 <w:webHidden/>
               </w:rPr>
-              <w:instrText xml:space="preserve"> PAGEREF _Toc233372531 \h </w:instrText>
+              <w:instrText xml:space="preserve"> PAGEREF _Toc233652738 \h </w:instrText>
             </w:r>
             <w:r>
               <w:rPr>
@@ -3468,7 +3468,7 @@
               <w:noProof/>
             </w:rPr>
           </w:pPr>
-          <w:hyperlink w:anchor="_Toc233372532" w:history="1">
+          <w:hyperlink w:anchor="_Toc233652739" w:history="1">
             <w:r>
               <w:rPr>
                 <w:rStyle w:val="Hyperlink"/>
@@ -3495,7 +3495,7 @@
                 <w:noProof/>
                 <w:webHidden/>
               </w:rPr>
-              <w:instrText xml:space="preserve"> PAGEREF _Toc233372532 \h </w:instrText>
+              <w:instrText xml:space="preserve"> PAGEREF _Toc233652739 \h </w:instrText>
             </w:r>
             <w:r>
               <w:rPr>
@@ -3542,7 +3542,7 @@
       <w:pPr>
         <w:pStyle w:val="Heading1"/>
       </w:pPr>
-      <w:bookmarkStart w:id="0" w:name="_Toc233372483"/>
+      <w:bookmarkStart w:id="0" w:name="_Toc233652690"/>
       <w:r>
         <w:lastRenderedPageBreak/>
         <w:t>System Overview</w:t>
@@ -3650,7 +3650,7 @@
       <w:pPr>
         <w:pStyle w:val="Heading1"/>
       </w:pPr>
-      <w:bookmarkStart w:id="1" w:name="_Toc233372484"/>
+      <w:bookmarkStart w:id="1" w:name="_Toc233652691"/>
       <w:r>
         <w:t>Architecture Overview</w:t>
       </w:r>
@@ -3690,11 +3690,9 @@
           <w:numId w:val="2"/>
         </w:numPr>
       </w:pPr>
-      <w:proofErr w:type="spellStart"/>
       <w:r>
         <w:t>ViewModel</w:t>
       </w:r>
-      <w:proofErr w:type="spellEnd"/>
       <w:r>
         <w:t xml:space="preserve">: </w:t>
       </w:r>
@@ -3723,15 +3721,7 @@
         <w:t xml:space="preserve"> </w:t>
       </w:r>
       <w:r>
-        <w:t xml:space="preserve">data operations and mediates between </w:t>
-      </w:r>
-      <w:proofErr w:type="spellStart"/>
-      <w:r>
-        <w:t>ViewModels</w:t>
-      </w:r>
-      <w:proofErr w:type="spellEnd"/>
-      <w:r>
-        <w:t xml:space="preserve"> and the database.</w:t>
+        <w:t>data operations and mediates between ViewModels and the database.</w:t>
       </w:r>
     </w:p>
     <w:p>
@@ -3799,7 +3789,7 @@
       <w:pPr>
         <w:pStyle w:val="Heading1"/>
       </w:pPr>
-      <w:bookmarkStart w:id="2" w:name="_Toc233372485"/>
+      <w:bookmarkStart w:id="2" w:name="_Toc233652692"/>
       <w:r>
         <w:t>Architecture Diagram</w:t>
       </w:r>
@@ -3832,7 +3822,7 @@
       <w:pPr>
         <w:pStyle w:val="Heading1"/>
       </w:pPr>
-      <w:bookmarkStart w:id="3" w:name="_Toc233372486"/>
+      <w:bookmarkStart w:id="3" w:name="_Toc233652693"/>
       <w:r>
         <w:t>Class Diagram</w:t>
       </w:r>
@@ -3890,7 +3880,7 @@
       <w:pPr>
         <w:pStyle w:val="Heading1"/>
       </w:pPr>
-      <w:bookmarkStart w:id="4" w:name="_Toc233372487"/>
+      <w:bookmarkStart w:id="4" w:name="_Toc233652694"/>
       <w:r>
         <w:lastRenderedPageBreak/>
         <w:t>Web App Hosted with HTML Code</w:t>
@@ -3914,7 +3904,7 @@
       <w:pPr>
         <w:pStyle w:val="Heading1"/>
       </w:pPr>
-      <w:bookmarkStart w:id="5" w:name="_Toc233372488"/>
+      <w:bookmarkStart w:id="5" w:name="_Toc233652695"/>
       <w:r>
         <w:t>GitLab Repository</w:t>
       </w:r>
@@ -3941,13 +3931,8 @@
         <w:t>Branch/Version</w:t>
       </w:r>
       <w:r>
-        <w:t xml:space="preserve">: </w:t>
-      </w:r>
-      <w:proofErr w:type="spellStart"/>
-      <w:r>
-        <w:t>working_branch</w:t>
-      </w:r>
-      <w:proofErr w:type="spellEnd"/>
+        <w:t>: working_branch</w:t>
+      </w:r>
     </w:p>
     <w:p>
       <w:r>
@@ -3962,7 +3947,7 @@
       <w:pPr>
         <w:pStyle w:val="Heading1"/>
       </w:pPr>
-      <w:bookmarkStart w:id="6" w:name="_Toc233372489"/>
+      <w:bookmarkStart w:id="6" w:name="_Toc233652696"/>
       <w:r>
         <w:t>User Guide</w:t>
       </w:r>
@@ -3978,7 +3963,7 @@
       <w:pPr>
         <w:pStyle w:val="Heading2"/>
       </w:pPr>
-      <w:bookmarkStart w:id="7" w:name="_Toc233372490"/>
+      <w:bookmarkStart w:id="7" w:name="_Toc233652697"/>
       <w:r>
         <w:t>System Requirements</w:t>
       </w:r>
@@ -4051,7 +4036,7 @@
       <w:pPr>
         <w:pStyle w:val="Heading2"/>
       </w:pPr>
-      <w:bookmarkStart w:id="8" w:name="_Toc233372491"/>
+      <w:bookmarkStart w:id="8" w:name="_Toc233652698"/>
       <w:r>
         <w:t>Installation Instructions</w:t>
       </w:r>
@@ -4124,7 +4109,7 @@
       <w:pPr>
         <w:pStyle w:val="Heading2"/>
       </w:pPr>
-      <w:bookmarkStart w:id="9" w:name="_Toc233372492"/>
+      <w:bookmarkStart w:id="9" w:name="_Toc233652699"/>
       <w:r>
         <w:t>Running the Application</w:t>
       </w:r>
@@ -4134,7 +4119,7 @@
       <w:pPr>
         <w:pStyle w:val="Heading3"/>
       </w:pPr>
-      <w:bookmarkStart w:id="10" w:name="_Toc233372493"/>
+      <w:bookmarkStart w:id="10" w:name="_Toc233652700"/>
       <w:r>
         <w:t>Option A: Physical Device</w:t>
       </w:r>
@@ -4148,13 +4133,8 @@
           <w:numId w:val="7"/>
         </w:numPr>
       </w:pPr>
-      <w:proofErr w:type="gramStart"/>
-      <w:r>
-        <w:t>Enable</w:t>
-      </w:r>
-      <w:proofErr w:type="gramEnd"/>
-      <w:r>
-        <w:t xml:space="preserve"> Developer Options</w:t>
+      <w:r>
+        <w:t>Enable Developer Options</w:t>
       </w:r>
     </w:p>
     <w:p>
@@ -4210,7 +4190,7 @@
       <w:pPr>
         <w:pStyle w:val="Heading3"/>
       </w:pPr>
-      <w:bookmarkStart w:id="11" w:name="_Toc233372494"/>
+      <w:bookmarkStart w:id="11" w:name="_Toc233652701"/>
       <w:r>
         <w:t>Option B: Emulator</w:t>
       </w:r>
@@ -4268,7 +4248,7 @@
       <w:pPr>
         <w:pStyle w:val="Heading2"/>
       </w:pPr>
-      <w:bookmarkStart w:id="12" w:name="_Toc233372495"/>
+      <w:bookmarkStart w:id="12" w:name="_Toc233652702"/>
       <w:r>
         <w:t>Project Structure</w:t>
       </w:r>
@@ -4320,7 +4300,7 @@
       <w:pPr>
         <w:pStyle w:val="Heading2"/>
       </w:pPr>
-      <w:bookmarkStart w:id="13" w:name="_Toc233372496"/>
+      <w:bookmarkStart w:id="13" w:name="_Toc233652703"/>
       <w:r>
         <w:t>Database Maintenance</w:t>
       </w:r>
@@ -4347,7 +4327,7 @@
       <w:pPr>
         <w:pStyle w:val="Heading2"/>
       </w:pPr>
-      <w:bookmarkStart w:id="14" w:name="_Toc233372497"/>
+      <w:bookmarkStart w:id="14" w:name="_Toc233652704"/>
       <w:r>
         <w:t>Alerts &amp; Notifications</w:t>
       </w:r>
@@ -4355,26 +4335,8 @@
     </w:p>
     <w:p>
       <w:r>
-        <w:t xml:space="preserve">Alerts use </w:t>
-      </w:r>
-      <w:proofErr w:type="spellStart"/>
-      <w:r>
-        <w:t>AlarmManager</w:t>
-      </w:r>
-      <w:proofErr w:type="spellEnd"/>
-      <w:r>
-        <w:t xml:space="preserve"> and </w:t>
-      </w:r>
-      <w:proofErr w:type="gramStart"/>
-      <w:r>
-        <w:t xml:space="preserve">a </w:t>
-      </w:r>
-      <w:proofErr w:type="spellStart"/>
-      <w:r>
-        <w:t>BroadcastReceiver</w:t>
-      </w:r>
-      <w:proofErr w:type="spellEnd"/>
-      <w:proofErr w:type="gramEnd"/>
+        <w:t>Alerts use AlarmManager and a BroadcastReceiver</w:t>
+      </w:r>
       <w:r>
         <w:t>. If alerts do not appear, ensure notification permission is granted.</w:t>
       </w:r>
@@ -4383,7 +4345,7 @@
       <w:pPr>
         <w:pStyle w:val="Heading2"/>
       </w:pPr>
-      <w:bookmarkStart w:id="15" w:name="_Toc233372498"/>
+      <w:bookmarkStart w:id="15" w:name="_Toc233652705"/>
       <w:r>
         <w:t>Updating Dependencies</w:t>
       </w:r>
@@ -4452,7 +4414,7 @@
       <w:pPr>
         <w:pStyle w:val="Heading2"/>
       </w:pPr>
-      <w:bookmarkStart w:id="16" w:name="_Toc233372499"/>
+      <w:bookmarkStart w:id="16" w:name="_Toc233652706"/>
       <w:r>
         <w:t>Troubleshooting</w:t>
       </w:r>
@@ -4460,13 +4422,8 @@
     </w:p>
     <w:p>
       <w:r>
-        <w:t xml:space="preserve">If app won’t </w:t>
-      </w:r>
-      <w:proofErr w:type="gramStart"/>
-      <w:r>
-        <w:t>build</w:t>
-      </w:r>
-      <w:proofErr w:type="gramEnd"/>
+        <w:t>If app won’t build</w:t>
+      </w:r>
       <w:r>
         <w:t xml:space="preserve"> try the following:</w:t>
       </w:r>
@@ -4560,7 +4517,7 @@
       <w:pPr>
         <w:pStyle w:val="Heading1"/>
       </w:pPr>
-      <w:bookmarkStart w:id="17" w:name="_Toc233372500"/>
+      <w:bookmarkStart w:id="17" w:name="_Toc233652707"/>
       <w:r>
         <w:t>User Guide for Running the Application</w:t>
       </w:r>
@@ -4570,7 +4527,7 @@
       <w:pPr>
         <w:pStyle w:val="Heading2"/>
       </w:pPr>
-      <w:bookmarkStart w:id="18" w:name="_Toc233372501"/>
+      <w:bookmarkStart w:id="18" w:name="_Toc233652708"/>
       <w:r>
         <w:t>Introduction</w:t>
       </w:r>
@@ -4591,7 +4548,7 @@
       <w:pPr>
         <w:pStyle w:val="Heading2"/>
       </w:pPr>
-      <w:bookmarkStart w:id="19" w:name="_Toc233372502"/>
+      <w:bookmarkStart w:id="19" w:name="_Toc233652709"/>
       <w:r>
         <w:t>Launching the Application</w:t>
       </w:r>
@@ -4625,7 +4582,7 @@
       <w:pPr>
         <w:pStyle w:val="Heading2"/>
       </w:pPr>
-      <w:bookmarkStart w:id="20" w:name="_Toc233372503"/>
+      <w:bookmarkStart w:id="20" w:name="_Toc233652710"/>
       <w:r>
         <w:t>Home Screen (Vacation List Screen)</w:t>
       </w:r>
@@ -4734,7 +4691,7 @@
       <w:pPr>
         <w:pStyle w:val="Heading2"/>
       </w:pPr>
-      <w:bookmarkStart w:id="21" w:name="_Toc233372504"/>
+      <w:bookmarkStart w:id="21" w:name="_Toc233652711"/>
       <w:r>
         <w:t>Adding a Vacation</w:t>
       </w:r>
@@ -4914,7 +4871,7 @@
       <w:pPr>
         <w:pStyle w:val="Heading2"/>
       </w:pPr>
-      <w:bookmarkStart w:id="22" w:name="_Toc233372505"/>
+      <w:bookmarkStart w:id="22" w:name="_Toc233652712"/>
       <w:r>
         <w:t>Viewing and Editing a Vacation</w:t>
       </w:r>
@@ -5026,7 +4983,7 @@
       <w:pPr>
         <w:pStyle w:val="Heading3"/>
       </w:pPr>
-      <w:bookmarkStart w:id="23" w:name="_Toc233372506"/>
+      <w:bookmarkStart w:id="23" w:name="_Toc233652713"/>
       <w:r>
         <w:t>Adding an Excursion</w:t>
       </w:r>
@@ -5142,9 +5099,21 @@
     </w:p>
     <w:p>
       <w:pPr>
+        <w:pStyle w:val="ListParagraph"/>
+        <w:numPr>
+          <w:ilvl w:val="0"/>
+          <w:numId w:val="25"/>
+        </w:numPr>
+      </w:pPr>
+      <w:r>
+        <w:t>Note: An excursion will have an alert notification for the same day of the excursion date.</w:t>
+      </w:r>
+    </w:p>
+    <w:p>
+      <w:pPr>
         <w:pStyle w:val="Heading3"/>
       </w:pPr>
-      <w:bookmarkStart w:id="24" w:name="_Toc233372507"/>
+      <w:bookmarkStart w:id="24" w:name="_Toc233652714"/>
       <w:r>
         <w:t>Editing or Deleting an Excursion</w:t>
       </w:r>
@@ -5190,7 +5159,7 @@
       <w:pPr>
         <w:pStyle w:val="Heading3"/>
       </w:pPr>
-      <w:bookmarkStart w:id="25" w:name="_Toc233372508"/>
+      <w:bookmarkStart w:id="25" w:name="_Toc233652715"/>
       <w:r>
         <w:t>Viewing the Vacation Report</w:t>
       </w:r>
@@ -5262,15 +5231,7 @@
         </w:numPr>
       </w:pPr>
       <w:r>
-        <w:t xml:space="preserve">Excursions: list of excursions </w:t>
-      </w:r>
-      <w:proofErr w:type="gramStart"/>
-      <w:r>
-        <w:t>with</w:t>
-      </w:r>
-      <w:proofErr w:type="gramEnd"/>
-      <w:r>
-        <w:t xml:space="preserve"> their cost</w:t>
+        <w:t>Excursions: list of excursions with their cost</w:t>
       </w:r>
     </w:p>
     <w:p>
@@ -5307,7 +5268,7 @@
       <w:pPr>
         <w:pStyle w:val="Heading3"/>
       </w:pPr>
-      <w:bookmarkStart w:id="26" w:name="_Toc233372509"/>
+      <w:bookmarkStart w:id="26" w:name="_Toc233652716"/>
       <w:r>
         <w:t>Alerts and Reminders</w:t>
       </w:r>
@@ -5429,12 +5390,19 @@
       <w:r>
         <w:t>appear.</w:t>
       </w:r>
+      <w:r>
+        <w:t xml:space="preserve"> All alerts in the Vacation Planner app are scheduled to trigger at 8:00 AM local device time. This </w:t>
+      </w:r>
+      <w:r>
+        <w:lastRenderedPageBreak/>
+        <w:t>includes the “trip starts today” notification, all reminder-day notification, and all excursion alerts.</w:t>
+      </w:r>
     </w:p>
     <w:p>
       <w:pPr>
         <w:pStyle w:val="Heading3"/>
       </w:pPr>
-      <w:bookmarkStart w:id="27" w:name="_Toc233372510"/>
+      <w:bookmarkStart w:id="27" w:name="_Toc233652717"/>
       <w:r>
         <w:t>Show Summary</w:t>
       </w:r>
@@ -5466,7 +5434,6 @@
     </w:p>
     <w:p>
       <w:r>
-        <w:lastRenderedPageBreak/>
         <w:t>This will show the summary of the vacation including its excursions</w:t>
       </w:r>
     </w:p>
@@ -5474,7 +5441,7 @@
       <w:pPr>
         <w:pStyle w:val="Heading3"/>
       </w:pPr>
-      <w:bookmarkStart w:id="28" w:name="_Toc233372511"/>
+      <w:bookmarkStart w:id="28" w:name="_Toc233652718"/>
       <w:r>
         <w:t>Excursions</w:t>
       </w:r>
@@ -5543,7 +5510,7 @@
       <w:pPr>
         <w:pStyle w:val="Heading3"/>
       </w:pPr>
-      <w:bookmarkStart w:id="29" w:name="_Toc233372512"/>
+      <w:bookmarkStart w:id="29" w:name="_Toc233652719"/>
       <w:r>
         <w:t>Exiting the Application</w:t>
       </w:r>
@@ -5577,7 +5544,7 @@
       <w:pPr>
         <w:pStyle w:val="Heading1"/>
       </w:pPr>
-      <w:bookmarkStart w:id="30" w:name="_Toc233372513"/>
+      <w:bookmarkStart w:id="30" w:name="_Toc233652720"/>
       <w:r>
         <w:t>Testing Documentation</w:t>
       </w:r>
@@ -5592,7 +5559,7 @@
       <w:pPr>
         <w:pStyle w:val="Heading1"/>
       </w:pPr>
-      <w:bookmarkStart w:id="31" w:name="_Toc233372514"/>
+      <w:bookmarkStart w:id="31" w:name="_Toc233652721"/>
       <w:r>
         <w:t>Test Plan for Unit Tests</w:t>
       </w:r>
@@ -5600,22 +5567,14 @@
     </w:p>
     <w:p>
       <w:r>
-        <w:t xml:space="preserve">The purpose of units testing in this project is to verify that core application logic behaves correctly, including database operations, validation rules, and </w:t>
-      </w:r>
-      <w:proofErr w:type="spellStart"/>
-      <w:r>
-        <w:t>ViewModel</w:t>
-      </w:r>
-      <w:proofErr w:type="spellEnd"/>
-      <w:r>
-        <w:t xml:space="preserve"> state updates.</w:t>
+        <w:t>The purpose of units testing in this project is to verify that core application logic behaves correctly, including database operations, validation rules, and ViewModel state updates.</w:t>
       </w:r>
     </w:p>
     <w:p>
       <w:pPr>
         <w:pStyle w:val="Heading2"/>
       </w:pPr>
-      <w:bookmarkStart w:id="32" w:name="_Toc233372515"/>
+      <w:bookmarkStart w:id="32" w:name="_Toc233652722"/>
       <w:r>
         <w:t>Test Case 1: Insert Vacation Successfully</w:t>
       </w:r>
@@ -5652,15 +5611,7 @@
         </w:numPr>
       </w:pPr>
       <w:r>
-        <w:t xml:space="preserve">Insert using </w:t>
-      </w:r>
-      <w:proofErr w:type="spellStart"/>
-      <w:r>
-        <w:t>VacationDao.insert</w:t>
-      </w:r>
-      <w:proofErr w:type="spellEnd"/>
-      <w:r>
-        <w:t>()</w:t>
+        <w:t>Insert using VacationDao.insert()</w:t>
       </w:r>
     </w:p>
     <w:p>
@@ -5672,20 +5623,7 @@
         </w:numPr>
       </w:pPr>
       <w:r>
-        <w:t xml:space="preserve">Query using </w:t>
-      </w:r>
-      <w:proofErr w:type="spellStart"/>
-      <w:proofErr w:type="gramStart"/>
-      <w:r>
-        <w:t>getAll</w:t>
-      </w:r>
-      <w:proofErr w:type="spellEnd"/>
-      <w:r>
-        <w:t>(</w:t>
-      </w:r>
-      <w:proofErr w:type="gramEnd"/>
-      <w:r>
-        <w:t>)</w:t>
+        <w:t>Query using getAll()</w:t>
       </w:r>
     </w:p>
     <w:p>
@@ -5750,7 +5688,7 @@
       <w:pPr>
         <w:pStyle w:val="Heading2"/>
       </w:pPr>
-      <w:bookmarkStart w:id="33" w:name="_Toc233372516"/>
+      <w:bookmarkStart w:id="33" w:name="_Toc233652723"/>
       <w:r>
         <w:t>Test Case 2: Prevent Invalid Budget Input</w:t>
       </w:r>
@@ -5776,15 +5714,7 @@
       </w:pPr>
       <w:r>
         <w:lastRenderedPageBreak/>
-        <w:t>Enter “</w:t>
-      </w:r>
-      <w:proofErr w:type="spellStart"/>
-      <w:r>
-        <w:t>abc</w:t>
-      </w:r>
-      <w:proofErr w:type="spellEnd"/>
-      <w:r>
-        <w:t>” into budget field</w:t>
+        <w:t>Enter “abc” into budget field</w:t>
       </w:r>
     </w:p>
     <w:p>
@@ -5819,14 +5749,11 @@
     </w:p>
     <w:p>
       <w:r>
-        <w:rPr>
-          <w:noProof/>
-        </w:rPr>
         <w:drawing>
-          <wp:inline distT="0" distB="0" distL="0" distR="0" wp14:anchorId="6C508342" wp14:editId="3C60185C">
-            <wp:extent cx="3246401" cy="6980525"/>
-            <wp:effectExtent l="0" t="0" r="0" b="0"/>
-            <wp:docPr id="1203404080" name="Picture 1" descr="The image displays a digital budget tracking screen for a planned 5-day trip, showing a total budget of $2,000, with $300 allocated for hotel costs and no excursions, leaving $1,700 remaining.&#10;&#10;AI-generated content may be incorrect."/>
+          <wp:inline distT="0" distB="0" distL="0" distR="0" wp14:anchorId="304873E4" wp14:editId="264C0B70">
+            <wp:extent cx="3215919" cy="7011008"/>
+            <wp:effectExtent l="0" t="0" r="3810" b="0"/>
+            <wp:docPr id="1100457107" name="Picture 1" descr="The image displays a travel budget summary with details of a hotel cost, trip duration, and remaining budget, showing a hotel cost of $200 and a total trip cost of $200.&#10;&#10;AI-generated content may be incorrect."/>
             <wp:cNvGraphicFramePr>
               <a:graphicFrameLocks xmlns:a="http://schemas.openxmlformats.org/drawingml/2006/main" noChangeAspect="1"/>
             </wp:cNvGraphicFramePr>
@@ -5834,7 +5761,7 @@
               <a:graphicData uri="http://schemas.openxmlformats.org/drawingml/2006/picture">
                 <pic:pic xmlns:pic="http://schemas.openxmlformats.org/drawingml/2006/picture">
                   <pic:nvPicPr>
-                    <pic:cNvPr id="1203404080" name="Picture 1" descr="The image displays a digital budget tracking screen for a planned 5-day trip, showing a total budget of $2,000, with $300 allocated for hotel costs and no excursions, leaving $1,700 remaining.&#10;&#10;AI-generated content may be incorrect."/>
+                    <pic:cNvPr id="1100457107" name="Picture 1" descr="The image displays a travel budget summary with details of a hotel cost, trip duration, and remaining budget, showing a hotel cost of $200 and a total trip cost of $200.&#10;&#10;AI-generated content may be incorrect."/>
                     <pic:cNvPicPr/>
                   </pic:nvPicPr>
                   <pic:blipFill>
@@ -5846,7 +5773,7 @@
                   <pic:spPr>
                     <a:xfrm>
                       <a:off x="0" y="0"/>
-                      <a:ext cx="3246401" cy="6980525"/>
+                      <a:ext cx="3215919" cy="7011008"/>
                     </a:xfrm>
                     <a:prstGeom prst="rect">
                       <a:avLst/>
@@ -5863,7 +5790,7 @@
       <w:pPr>
         <w:pStyle w:val="Heading2"/>
       </w:pPr>
-      <w:bookmarkStart w:id="34" w:name="_Toc233372517"/>
+      <w:bookmarkStart w:id="34" w:name="_Toc233652724"/>
       <w:r>
         <w:lastRenderedPageBreak/>
         <w:t>Test Case 3: Delete Vacation Successfully</w:t>
@@ -5901,15 +5828,7 @@
         </w:numPr>
       </w:pPr>
       <w:r>
-        <w:t xml:space="preserve">Delete using </w:t>
-      </w:r>
-      <w:proofErr w:type="spellStart"/>
-      <w:r>
-        <w:t>VacationDao.delete</w:t>
-      </w:r>
-      <w:proofErr w:type="spellEnd"/>
-      <w:r>
-        <w:t>()</w:t>
+        <w:t>Delete using VacationDao.delete()</w:t>
       </w:r>
     </w:p>
     <w:p>
@@ -5921,20 +5840,7 @@
         </w:numPr>
       </w:pPr>
       <w:r>
-        <w:t xml:space="preserve">Query using </w:t>
-      </w:r>
-      <w:proofErr w:type="spellStart"/>
-      <w:proofErr w:type="gramStart"/>
-      <w:r>
-        <w:t>getAll</w:t>
-      </w:r>
-      <w:proofErr w:type="spellEnd"/>
-      <w:r>
-        <w:t>(</w:t>
-      </w:r>
-      <w:proofErr w:type="gramEnd"/>
-      <w:r>
-        <w:t>)</w:t>
+        <w:t>Query using getAll()</w:t>
       </w:r>
     </w:p>
     <w:p>
@@ -6037,7 +5943,7 @@
       <w:pPr>
         <w:pStyle w:val="Heading2"/>
       </w:pPr>
-      <w:bookmarkStart w:id="35" w:name="_Toc233372518"/>
+      <w:bookmarkStart w:id="35" w:name="_Toc233652725"/>
       <w:r>
         <w:t xml:space="preserve">Test Case 4: </w:t>
       </w:r>
@@ -6096,15 +6002,7 @@
         </w:numPr>
       </w:pPr>
       <w:r>
-        <w:t xml:space="preserve">Insert the excursion using </w:t>
-      </w:r>
-      <w:proofErr w:type="spellStart"/>
-      <w:r>
-        <w:t>ExcursionDao.insert</w:t>
-      </w:r>
-      <w:proofErr w:type="spellEnd"/>
-      <w:r>
-        <w:t>().</w:t>
+        <w:t>Insert the excursion using ExcursionDao.insert().</w:t>
       </w:r>
     </w:p>
     <w:p>
@@ -6116,20 +6014,7 @@
         </w:numPr>
       </w:pPr>
       <w:r>
-        <w:t xml:space="preserve">Query excursions for that vacation using </w:t>
-      </w:r>
-      <w:proofErr w:type="spellStart"/>
-      <w:proofErr w:type="gramStart"/>
-      <w:r>
-        <w:t>getExcursionsByVacationId</w:t>
-      </w:r>
-      <w:proofErr w:type="spellEnd"/>
-      <w:r>
-        <w:t>(</w:t>
-      </w:r>
-      <w:proofErr w:type="gramEnd"/>
-      <w:r>
-        <w:t>).</w:t>
+        <w:t>Query excursions for that vacation using getExcursionsByVacationId().</w:t>
       </w:r>
     </w:p>
     <w:p>
@@ -6165,15 +6050,7 @@
         </w:numPr>
       </w:pPr>
       <w:r>
-        <w:t xml:space="preserve">The excursion’s </w:t>
-      </w:r>
-      <w:proofErr w:type="spellStart"/>
-      <w:r>
-        <w:t>vacationId</w:t>
-      </w:r>
-      <w:proofErr w:type="spellEnd"/>
-      <w:r>
-        <w:t xml:space="preserve"> matches the vacation’s ID.</w:t>
+        <w:t>The excursion’s vacationId matches the vacation’s ID.</w:t>
       </w:r>
     </w:p>
     <w:p>
@@ -6190,15 +6067,12 @@
     </w:p>
     <w:p>
       <w:r>
-        <w:rPr>
-          <w:noProof/>
-        </w:rPr>
         <w:lastRenderedPageBreak/>
         <w:drawing>
-          <wp:inline distT="0" distB="0" distL="0" distR="0" wp14:anchorId="2B80BA54" wp14:editId="2D543D29">
-            <wp:extent cx="3215919" cy="6950042"/>
-            <wp:effectExtent l="0" t="0" r="3810" b="3810"/>
-            <wp:docPr id="1501286789" name="Picture 1" descr="The image displays a mobile app screen showing a vacation itinerary for France, detailing the hotel stay, budget, and costs.&#10;&#10;AI-generated content may be incorrect."/>
+          <wp:inline distT="0" distB="0" distL="0" distR="0" wp14:anchorId="1E21A6A9" wp14:editId="78A7ABFD">
+            <wp:extent cx="3558848" cy="7331075"/>
+            <wp:effectExtent l="0" t="0" r="3810" b="3175"/>
+            <wp:docPr id="1299738231" name="Picture 1" descr="The image displays a mobile app interface for a travel planning app, showing a detailed itinerary for an Italian hotel stay, including dates, budget, costs, and remaining funds.&#10;&#10;AI-generated content may be incorrect."/>
             <wp:cNvGraphicFramePr>
               <a:graphicFrameLocks xmlns:a="http://schemas.openxmlformats.org/drawingml/2006/main" noChangeAspect="1"/>
             </wp:cNvGraphicFramePr>
@@ -6206,7 +6080,7 @@
               <a:graphicData uri="http://schemas.openxmlformats.org/drawingml/2006/picture">
                 <pic:pic xmlns:pic="http://schemas.openxmlformats.org/drawingml/2006/picture">
                   <pic:nvPicPr>
-                    <pic:cNvPr id="1501286789" name="Picture 1" descr="The image displays a mobile app screen showing a vacation itinerary for France, detailing the hotel stay, budget, and costs.&#10;&#10;AI-generated content may be incorrect."/>
+                    <pic:cNvPr id="1299738231" name="Picture 1" descr="The image displays a mobile app interface for a travel planning app, showing a detailed itinerary for an Italian hotel stay, including dates, budget, costs, and remaining funds.&#10;&#10;AI-generated content may be incorrect."/>
                     <pic:cNvPicPr/>
                   </pic:nvPicPr>
                   <pic:blipFill>
@@ -6218,7 +6092,7 @@
                   <pic:spPr>
                     <a:xfrm>
                       <a:off x="0" y="0"/>
-                      <a:ext cx="3215919" cy="6950042"/>
+                      <a:ext cx="3558848" cy="7331075"/>
                     </a:xfrm>
                     <a:prstGeom prst="rect">
                       <a:avLst/>
@@ -6233,15 +6107,12 @@
     </w:p>
     <w:p>
       <w:r>
-        <w:rPr>
-          <w:noProof/>
-        </w:rPr>
         <w:lastRenderedPageBreak/>
         <w:drawing>
-          <wp:inline distT="0" distB="0" distL="0" distR="0" wp14:anchorId="05CF6C8B" wp14:editId="37977268">
-            <wp:extent cx="3139712" cy="6896698"/>
-            <wp:effectExtent l="0" t="0" r="3810" b="0"/>
-            <wp:docPr id="630177291" name="Picture 1" descr="The image displays a mobile app screen with a calendar for vacation planning, including alert reminders for upcoming trips and an option to add excursions.&#10;&#10;AI-generated content may be incorrect."/>
+          <wp:inline distT="0" distB="0" distL="0" distR="0" wp14:anchorId="2FA8EFAA" wp14:editId="194E1D3D">
+            <wp:extent cx="3368332" cy="7216765"/>
+            <wp:effectExtent l="0" t="0" r="3810" b="3810"/>
+            <wp:docPr id="1692637903" name="Picture 1" descr="The image displays a mobile device screen with a vacation management app, showing options for setting alerts for trip reminders, and a list of excursions sorted by date, including a concert event.&#10;&#10;AI-generated content may be incorrect."/>
             <wp:cNvGraphicFramePr>
               <a:graphicFrameLocks xmlns:a="http://schemas.openxmlformats.org/drawingml/2006/main" noChangeAspect="1"/>
             </wp:cNvGraphicFramePr>
@@ -6249,7 +6120,7 @@
               <a:graphicData uri="http://schemas.openxmlformats.org/drawingml/2006/picture">
                 <pic:pic xmlns:pic="http://schemas.openxmlformats.org/drawingml/2006/picture">
                   <pic:nvPicPr>
-                    <pic:cNvPr id="630177291" name="Picture 1" descr="The image displays a mobile app screen with a calendar for vacation planning, including alert reminders for upcoming trips and an option to add excursions.&#10;&#10;AI-generated content may be incorrect."/>
+                    <pic:cNvPr id="1692637903" name="Picture 1" descr="The image displays a mobile device screen with a vacation management app, showing options for setting alerts for trip reminders, and a list of excursions sorted by date, including a concert event.&#10;&#10;AI-generated content may be incorrect."/>
                     <pic:cNvPicPr/>
                   </pic:nvPicPr>
                   <pic:blipFill>
@@ -6261,7 +6132,7 @@
                   <pic:spPr>
                     <a:xfrm>
                       <a:off x="0" y="0"/>
-                      <a:ext cx="3139712" cy="6896698"/>
+                      <a:ext cx="3368332" cy="7216765"/>
                     </a:xfrm>
                     <a:prstGeom prst="rect">
                       <a:avLst/>
@@ -6278,7 +6149,7 @@
       <w:pPr>
         <w:pStyle w:val="Heading2"/>
       </w:pPr>
-      <w:bookmarkStart w:id="36" w:name="_Toc233372519"/>
+      <w:bookmarkStart w:id="36" w:name="_Toc233652726"/>
       <w:r>
         <w:t xml:space="preserve">Test Case 5: </w:t>
       </w:r>
@@ -6298,15 +6169,7 @@
         <w:t xml:space="preserve">Purpose: Verify that </w:t>
       </w:r>
       <w:r>
-        <w:t xml:space="preserve">all properties in the Trip Financial Summary </w:t>
-      </w:r>
-      <w:proofErr w:type="gramStart"/>
-      <w:r>
-        <w:t>is</w:t>
-      </w:r>
-      <w:proofErr w:type="gramEnd"/>
-      <w:r>
-        <w:t xml:space="preserve"> correctly calculated.</w:t>
+        <w:t>all properties in the Trip Financial Summary is correctly calculated.</w:t>
       </w:r>
     </w:p>
     <w:p>
@@ -6323,6 +6186,7 @@
         </w:numPr>
       </w:pPr>
       <w:r>
+        <w:lastRenderedPageBreak/>
         <w:t>Insert a vacation into the database</w:t>
       </w:r>
     </w:p>
@@ -6335,7 +6199,6 @@
         </w:numPr>
       </w:pPr>
       <w:r>
-        <w:lastRenderedPageBreak/>
         <w:t>Insert multiple excursions with different prices linked to that vacation</w:t>
       </w:r>
     </w:p>
@@ -6406,7 +6269,7 @@
       <w:pPr>
         <w:pStyle w:val="Heading1"/>
       </w:pPr>
-      <w:bookmarkStart w:id="37" w:name="_Toc233372520"/>
+      <w:bookmarkStart w:id="37" w:name="_Toc233652727"/>
       <w:r>
         <w:lastRenderedPageBreak/>
         <w:t>Unit Test Scripts</w:t>
@@ -6422,7 +6285,7 @@
       <w:pPr>
         <w:pStyle w:val="Heading2"/>
       </w:pPr>
-      <w:bookmarkStart w:id="38" w:name="_Toc233372521"/>
+      <w:bookmarkStart w:id="38" w:name="_Toc233652728"/>
       <w:r>
         <w:t>Test Script 1: Insert Vacation</w:t>
       </w:r>
@@ -6446,44 +6309,8 @@
         <w:rPr>
           <w:rFonts w:cs="Courier New"/>
         </w:rPr>
-        <w:t xml:space="preserve">private </w:t>
-      </w:r>
-      <w:proofErr w:type="spellStart"/>
-      <w:r>
-        <w:rPr>
-          <w:rFonts w:cs="Courier New"/>
-        </w:rPr>
-        <w:t>lateinit</w:t>
-      </w:r>
-      <w:proofErr w:type="spellEnd"/>
-      <w:r>
-        <w:rPr>
-          <w:rFonts w:cs="Courier New"/>
-        </w:rPr>
-        <w:t xml:space="preserve"> var </w:t>
-      </w:r>
-      <w:proofErr w:type="spellStart"/>
-      <w:r>
-        <w:rPr>
-          <w:rFonts w:cs="Courier New"/>
-        </w:rPr>
-        <w:t>db</w:t>
-      </w:r>
-      <w:proofErr w:type="spellEnd"/>
-      <w:r>
-        <w:rPr>
-          <w:rFonts w:cs="Courier New"/>
-        </w:rPr>
-        <w:t xml:space="preserve">: </w:t>
-      </w:r>
-      <w:proofErr w:type="spellStart"/>
-      <w:r>
-        <w:rPr>
-          <w:rFonts w:cs="Courier New"/>
-        </w:rPr>
-        <w:t>VacationDatabase</w:t>
-      </w:r>
-      <w:proofErr w:type="spellEnd"/>
+        <w:t>private lateinit var db: VacationDatabase</w:t>
+      </w:r>
     </w:p>
     <w:p>
       <w:pPr>
@@ -6514,30 +6341,8 @@
         <w:rPr>
           <w:rFonts w:cs="Courier New"/>
         </w:rPr>
-        <w:t xml:space="preserve">private </w:t>
-      </w:r>
-      <w:proofErr w:type="spellStart"/>
-      <w:r>
-        <w:rPr>
-          <w:rFonts w:cs="Courier New"/>
-        </w:rPr>
-        <w:t>lateinit</w:t>
-      </w:r>
-      <w:proofErr w:type="spellEnd"/>
-      <w:r>
-        <w:rPr>
-          <w:rFonts w:cs="Courier New"/>
-        </w:rPr>
-        <w:t xml:space="preserve"> var dao: </w:t>
-      </w:r>
-      <w:proofErr w:type="spellStart"/>
-      <w:r>
-        <w:rPr>
-          <w:rFonts w:cs="Courier New"/>
-        </w:rPr>
-        <w:t>VacationDao</w:t>
-      </w:r>
-      <w:proofErr w:type="spellEnd"/>
+        <w:t>private lateinit var dao: VacationDao</w:t>
+      </w:r>
     </w:p>
     <w:p>
       <w:pPr>
@@ -6570,16 +6375,8 @@
         <w:rPr>
           <w:rFonts w:cs="Courier New"/>
         </w:rPr>
-        <w:t xml:space="preserve">    </w:t>
-      </w:r>
-      <w:proofErr w:type="gramStart"/>
-      <w:r>
-        <w:rPr>
-          <w:rFonts w:cs="Courier New"/>
-        </w:rPr>
-        <w:t>@Before</w:t>
-      </w:r>
-      <w:proofErr w:type="gramEnd"/>
+        <w:t xml:space="preserve">    @Before</w:t>
+      </w:r>
     </w:p>
     <w:p>
       <w:pPr>
@@ -6598,21 +6395,7 @@
         <w:rPr>
           <w:rFonts w:cs="Courier New"/>
         </w:rPr>
-        <w:t xml:space="preserve">    fun </w:t>
-      </w:r>
-      <w:proofErr w:type="gramStart"/>
-      <w:r>
-        <w:rPr>
-          <w:rFonts w:cs="Courier New"/>
-        </w:rPr>
-        <w:t>setup(</w:t>
-      </w:r>
-      <w:proofErr w:type="gramEnd"/>
-      <w:r>
-        <w:rPr>
-          <w:rFonts w:cs="Courier New"/>
-        </w:rPr>
-        <w:t>) {</w:t>
+        <w:t xml:space="preserve">    fun setup() {</w:t>
       </w:r>
     </w:p>
     <w:p>
@@ -6632,35 +6415,7 @@
         <w:rPr>
           <w:rFonts w:cs="Courier New"/>
         </w:rPr>
-        <w:t xml:space="preserve">        </w:t>
-      </w:r>
-      <w:proofErr w:type="spellStart"/>
-      <w:r>
-        <w:rPr>
-          <w:rFonts w:cs="Courier New"/>
-        </w:rPr>
-        <w:t>db</w:t>
-      </w:r>
-      <w:proofErr w:type="spellEnd"/>
-      <w:r>
-        <w:rPr>
-          <w:rFonts w:cs="Courier New"/>
-        </w:rPr>
-        <w:t xml:space="preserve"> = </w:t>
-      </w:r>
-      <w:proofErr w:type="spellStart"/>
-      <w:r>
-        <w:rPr>
-          <w:rFonts w:cs="Courier New"/>
-        </w:rPr>
-        <w:t>Room.inMemoryDatabaseBuilder</w:t>
-      </w:r>
-      <w:proofErr w:type="spellEnd"/>
-      <w:r>
-        <w:rPr>
-          <w:rFonts w:cs="Courier New"/>
-        </w:rPr>
-        <w:t>(</w:t>
+        <w:t xml:space="preserve">        db = Room.inMemoryDatabaseBuilder(</w:t>
       </w:r>
     </w:p>
     <w:p>
@@ -6680,21 +6435,7 @@
         <w:rPr>
           <w:rFonts w:cs="Courier New"/>
         </w:rPr>
-        <w:t xml:space="preserve">            </w:t>
-      </w:r>
-      <w:proofErr w:type="spellStart"/>
-      <w:r>
-        <w:rPr>
-          <w:rFonts w:cs="Courier New"/>
-        </w:rPr>
-        <w:t>ApplicationProvider.getApplicationContext</w:t>
-      </w:r>
-      <w:proofErr w:type="spellEnd"/>
-      <w:r>
-        <w:rPr>
-          <w:rFonts w:cs="Courier New"/>
-        </w:rPr>
-        <w:t>(),</w:t>
+        <w:t xml:space="preserve">            ApplicationProvider.getApplicationContext(),</w:t>
       </w:r>
     </w:p>
     <w:p>
@@ -6714,29 +6455,7 @@
         <w:rPr>
           <w:rFonts w:cs="Courier New"/>
         </w:rPr>
-        <w:t xml:space="preserve">            </w:t>
-      </w:r>
-      <w:proofErr w:type="spellStart"/>
-      <w:proofErr w:type="gramStart"/>
-      <w:r>
-        <w:rPr>
-          <w:rFonts w:cs="Courier New"/>
-        </w:rPr>
-        <w:t>VacationDatabase</w:t>
-      </w:r>
-      <w:proofErr w:type="spellEnd"/>
-      <w:r>
-        <w:rPr>
-          <w:rFonts w:cs="Courier New"/>
-        </w:rPr>
-        <w:t>::</w:t>
-      </w:r>
-      <w:proofErr w:type="gramEnd"/>
-      <w:r>
-        <w:rPr>
-          <w:rFonts w:cs="Courier New"/>
-        </w:rPr>
-        <w:t>class.java</w:t>
+        <w:t xml:space="preserve">            VacationDatabase::class.java</w:t>
       </w:r>
     </w:p>
     <w:p>
@@ -6756,43 +6475,7 @@
         <w:rPr>
           <w:rFonts w:cs="Courier New"/>
         </w:rPr>
-        <w:t xml:space="preserve">        </w:t>
-      </w:r>
-      <w:proofErr w:type="gramStart"/>
-      <w:r>
-        <w:rPr>
-          <w:rFonts w:cs="Courier New"/>
-        </w:rPr>
-        <w:t>).</w:t>
-      </w:r>
-      <w:proofErr w:type="spellStart"/>
-      <w:r>
-        <w:rPr>
-          <w:rFonts w:cs="Courier New"/>
-        </w:rPr>
-        <w:t>allowMainThreadQueries</w:t>
-      </w:r>
-      <w:proofErr w:type="spellEnd"/>
-      <w:proofErr w:type="gramEnd"/>
-      <w:r>
-        <w:rPr>
-          <w:rFonts w:cs="Courier New"/>
-        </w:rPr>
-        <w:t>(</w:t>
-      </w:r>
-      <w:proofErr w:type="gramStart"/>
-      <w:r>
-        <w:rPr>
-          <w:rFonts w:cs="Courier New"/>
-        </w:rPr>
-        <w:t>).build</w:t>
-      </w:r>
-      <w:proofErr w:type="gramEnd"/>
-      <w:r>
-        <w:rPr>
-          <w:rFonts w:cs="Courier New"/>
-        </w:rPr>
-        <w:t>()</w:t>
+        <w:t xml:space="preserve">        ).allowMainThreadQueries().build()</w:t>
       </w:r>
     </w:p>
     <w:p>
@@ -6812,23 +6495,7 @@
         <w:rPr>
           <w:rFonts w:cs="Courier New"/>
         </w:rPr>
-        <w:t xml:space="preserve">        dao = </w:t>
-      </w:r>
-      <w:proofErr w:type="spellStart"/>
-      <w:proofErr w:type="gramStart"/>
-      <w:r>
-        <w:rPr>
-          <w:rFonts w:cs="Courier New"/>
-        </w:rPr>
-        <w:t>db.vacationDao</w:t>
-      </w:r>
-      <w:proofErr w:type="spellEnd"/>
-      <w:proofErr w:type="gramEnd"/>
-      <w:r>
-        <w:rPr>
-          <w:rFonts w:cs="Courier New"/>
-        </w:rPr>
-        <w:t>()</w:t>
+        <w:t xml:space="preserve">        dao = db.vacationDao()</w:t>
       </w:r>
     </w:p>
     <w:p>
@@ -6902,21 +6569,7 @@
         <w:rPr>
           <w:rFonts w:cs="Courier New"/>
         </w:rPr>
-        <w:t xml:space="preserve">    fun </w:t>
-      </w:r>
-      <w:proofErr w:type="gramStart"/>
-      <w:r>
-        <w:rPr>
-          <w:rFonts w:cs="Courier New"/>
-        </w:rPr>
-        <w:t>teardown(</w:t>
-      </w:r>
-      <w:proofErr w:type="gramEnd"/>
-      <w:r>
-        <w:rPr>
-          <w:rFonts w:cs="Courier New"/>
-        </w:rPr>
-        <w:t>) {</w:t>
+        <w:t xml:space="preserve">    fun teardown() {</w:t>
       </w:r>
     </w:p>
     <w:p>
@@ -6936,23 +6589,7 @@
         <w:rPr>
           <w:rFonts w:cs="Courier New"/>
         </w:rPr>
-        <w:t xml:space="preserve">        </w:t>
-      </w:r>
-      <w:proofErr w:type="spellStart"/>
-      <w:proofErr w:type="gramStart"/>
-      <w:r>
-        <w:rPr>
-          <w:rFonts w:cs="Courier New"/>
-        </w:rPr>
-        <w:t>db.close</w:t>
-      </w:r>
-      <w:proofErr w:type="spellEnd"/>
-      <w:proofErr w:type="gramEnd"/>
-      <w:r>
-        <w:rPr>
-          <w:rFonts w:cs="Courier New"/>
-        </w:rPr>
-        <w:t>()</w:t>
+        <w:t xml:space="preserve">        db.close()</w:t>
       </w:r>
     </w:p>
     <w:p>
@@ -7006,16 +6643,8 @@
         <w:rPr>
           <w:rFonts w:cs="Courier New"/>
         </w:rPr>
-        <w:t xml:space="preserve">    </w:t>
-      </w:r>
-      <w:proofErr w:type="gramStart"/>
-      <w:r>
-        <w:rPr>
-          <w:rFonts w:cs="Courier New"/>
-        </w:rPr>
-        <w:t>@Test</w:t>
-      </w:r>
-      <w:proofErr w:type="gramEnd"/>
+        <w:t xml:space="preserve">    @Test</w:t>
+      </w:r>
     </w:p>
     <w:p>
       <w:pPr>
@@ -7034,49 +6663,7 @@
         <w:rPr>
           <w:rFonts w:cs="Courier New"/>
         </w:rPr>
-        <w:t xml:space="preserve">    fun </w:t>
-      </w:r>
-      <w:proofErr w:type="spellStart"/>
-      <w:r>
-        <w:rPr>
-          <w:rFonts w:cs="Courier New"/>
-        </w:rPr>
-        <w:t>insertVacation_</w:t>
-      </w:r>
-      <w:proofErr w:type="gramStart"/>
-      <w:r>
-        <w:rPr>
-          <w:rFonts w:cs="Courier New"/>
-        </w:rPr>
-        <w:t>savesCorrectly</w:t>
-      </w:r>
-      <w:proofErr w:type="spellEnd"/>
-      <w:r>
-        <w:rPr>
-          <w:rFonts w:cs="Courier New"/>
-        </w:rPr>
-        <w:t>(</w:t>
-      </w:r>
-      <w:proofErr w:type="gramEnd"/>
-      <w:r>
-        <w:rPr>
-          <w:rFonts w:cs="Courier New"/>
-        </w:rPr>
-        <w:t xml:space="preserve">) = </w:t>
-      </w:r>
-      <w:proofErr w:type="spellStart"/>
-      <w:r>
-        <w:rPr>
-          <w:rFonts w:cs="Courier New"/>
-        </w:rPr>
-        <w:t>runTest</w:t>
-      </w:r>
-      <w:proofErr w:type="spellEnd"/>
-      <w:r>
-        <w:rPr>
-          <w:rFonts w:cs="Courier New"/>
-        </w:rPr>
-        <w:t xml:space="preserve"> {</w:t>
+        <w:t xml:space="preserve">    fun insertVacation_savesCorrectly() = runTest {</w:t>
       </w:r>
     </w:p>
     <w:p>
@@ -7096,30 +6683,8 @@
         <w:rPr>
           <w:rFonts w:cs="Courier New"/>
         </w:rPr>
-        <w:t xml:space="preserve">        </w:t>
-      </w:r>
-      <w:proofErr w:type="spellStart"/>
-      <w:r>
-        <w:rPr>
-          <w:rFonts w:cs="Courier New"/>
-        </w:rPr>
-        <w:t>val</w:t>
-      </w:r>
-      <w:proofErr w:type="spellEnd"/>
-      <w:r>
-        <w:rPr>
-          <w:rFonts w:cs="Courier New"/>
-        </w:rPr>
-        <w:t xml:space="preserve"> vacation = </w:t>
-      </w:r>
-      <w:proofErr w:type="gramStart"/>
-      <w:r>
-        <w:rPr>
-          <w:rFonts w:cs="Courier New"/>
-        </w:rPr>
-        <w:t>Vacation(</w:t>
-      </w:r>
-      <w:proofErr w:type="gramEnd"/>
+        <w:t xml:space="preserve">        val vacation = Vacation(</w:t>
+      </w:r>
     </w:p>
     <w:p>
       <w:pPr>
@@ -7199,21 +6764,7 @@
         <w:rPr>
           <w:rFonts w:cs="Courier New"/>
         </w:rPr>
-        <w:t xml:space="preserve">            </w:t>
-      </w:r>
-      <w:proofErr w:type="spellStart"/>
-      <w:r>
-        <w:rPr>
-          <w:rFonts w:cs="Courier New"/>
-        </w:rPr>
-        <w:t>hotelCost</w:t>
-      </w:r>
-      <w:proofErr w:type="spellEnd"/>
-      <w:r>
-        <w:rPr>
-          <w:rFonts w:cs="Courier New"/>
-        </w:rPr>
-        <w:t xml:space="preserve"> = 200.0,</w:t>
+        <w:t xml:space="preserve">            hotelCost = 200.0,</w:t>
       </w:r>
     </w:p>
     <w:p>
@@ -7233,21 +6784,7 @@
         <w:rPr>
           <w:rFonts w:cs="Courier New"/>
         </w:rPr>
-        <w:t xml:space="preserve">            </w:t>
-      </w:r>
-      <w:proofErr w:type="spellStart"/>
-      <w:r>
-        <w:rPr>
-          <w:rFonts w:cs="Courier New"/>
-        </w:rPr>
-        <w:t>startDate</w:t>
-      </w:r>
-      <w:proofErr w:type="spellEnd"/>
-      <w:r>
-        <w:rPr>
-          <w:rFonts w:cs="Courier New"/>
-        </w:rPr>
-        <w:t xml:space="preserve"> = "07/11/2026",</w:t>
+        <w:t xml:space="preserve">            startDate = "07/11/2026",</w:t>
       </w:r>
     </w:p>
     <w:p>
@@ -7267,21 +6804,7 @@
         <w:rPr>
           <w:rFonts w:cs="Courier New"/>
         </w:rPr>
-        <w:t xml:space="preserve">            </w:t>
-      </w:r>
-      <w:proofErr w:type="spellStart"/>
-      <w:r>
-        <w:rPr>
-          <w:rFonts w:cs="Courier New"/>
-        </w:rPr>
-        <w:t>endDate</w:t>
-      </w:r>
-      <w:proofErr w:type="spellEnd"/>
-      <w:r>
-        <w:rPr>
-          <w:rFonts w:cs="Courier New"/>
-        </w:rPr>
-        <w:t xml:space="preserve"> = "08/11/2026",</w:t>
+        <w:t xml:space="preserve">            endDate = "08/11/2026",</w:t>
       </w:r>
     </w:p>
     <w:p>
@@ -7321,43 +6844,7 @@
         <w:rPr>
           <w:rFonts w:cs="Courier New"/>
         </w:rPr>
-        <w:t xml:space="preserve">            </w:t>
-      </w:r>
-      <w:proofErr w:type="spellStart"/>
-      <w:r>
-        <w:rPr>
-          <w:rFonts w:cs="Courier New"/>
-        </w:rPr>
-        <w:t>reminderDays</w:t>
-      </w:r>
-      <w:proofErr w:type="spellEnd"/>
-      <w:r>
-        <w:rPr>
-          <w:rFonts w:cs="Courier New"/>
-        </w:rPr>
-        <w:t xml:space="preserve"> = </w:t>
-      </w:r>
-      <w:proofErr w:type="spellStart"/>
-      <w:proofErr w:type="gramStart"/>
-      <w:r>
-        <w:rPr>
-          <w:rFonts w:cs="Courier New"/>
-        </w:rPr>
-        <w:t>listOf</w:t>
-      </w:r>
-      <w:proofErr w:type="spellEnd"/>
-      <w:r>
-        <w:rPr>
-          <w:rFonts w:cs="Courier New"/>
-        </w:rPr>
-        <w:t>(</w:t>
-      </w:r>
-      <w:proofErr w:type="gramEnd"/>
-      <w:r>
-        <w:rPr>
-          <w:rFonts w:cs="Courier New"/>
-        </w:rPr>
-        <w:t>1,3,5),</w:t>
+        <w:t xml:space="preserve">            reminderDays = listOf(1,3,5),</w:t>
       </w:r>
     </w:p>
     <w:p>
@@ -7377,21 +6864,7 @@
         <w:rPr>
           <w:rFonts w:cs="Courier New"/>
         </w:rPr>
-        <w:t xml:space="preserve">            </w:t>
-      </w:r>
-      <w:proofErr w:type="spellStart"/>
-      <w:r>
-        <w:rPr>
-          <w:rFonts w:cs="Courier New"/>
-        </w:rPr>
-        <w:t>isFavorite</w:t>
-      </w:r>
-      <w:proofErr w:type="spellEnd"/>
-      <w:r>
-        <w:rPr>
-          <w:rFonts w:cs="Courier New"/>
-        </w:rPr>
-        <w:t xml:space="preserve"> = false</w:t>
+        <w:t xml:space="preserve">            isFavorite = false</w:t>
       </w:r>
     </w:p>
     <w:p>
@@ -7445,23 +6918,7 @@
         <w:rPr>
           <w:rFonts w:cs="Courier New"/>
         </w:rPr>
-        <w:t xml:space="preserve">        </w:t>
-      </w:r>
-      <w:proofErr w:type="spellStart"/>
-      <w:proofErr w:type="gramStart"/>
-      <w:r>
-        <w:rPr>
-          <w:rFonts w:cs="Courier New"/>
-        </w:rPr>
-        <w:t>dao.insert</w:t>
-      </w:r>
-      <w:proofErr w:type="spellEnd"/>
-      <w:proofErr w:type="gramEnd"/>
-      <w:r>
-        <w:rPr>
-          <w:rFonts w:cs="Courier New"/>
-        </w:rPr>
-        <w:t>(vacation)</w:t>
+        <w:t xml:space="preserve">        dao.insert(vacation)</w:t>
       </w:r>
     </w:p>
     <w:p>
@@ -7481,51 +6938,7 @@
         <w:rPr>
           <w:rFonts w:cs="Courier New"/>
         </w:rPr>
-        <w:t xml:space="preserve">        </w:t>
-      </w:r>
-      <w:proofErr w:type="spellStart"/>
-      <w:r>
-        <w:rPr>
-          <w:rFonts w:cs="Courier New"/>
-        </w:rPr>
-        <w:t>val</w:t>
-      </w:r>
-      <w:proofErr w:type="spellEnd"/>
-      <w:r>
-        <w:rPr>
-          <w:rFonts w:cs="Courier New"/>
-        </w:rPr>
-        <w:t xml:space="preserve"> result = </w:t>
-      </w:r>
-      <w:proofErr w:type="spellStart"/>
-      <w:proofErr w:type="gramStart"/>
-      <w:r>
-        <w:rPr>
-          <w:rFonts w:cs="Courier New"/>
-        </w:rPr>
-        <w:t>dao.getAll</w:t>
-      </w:r>
-      <w:proofErr w:type="spellEnd"/>
-      <w:proofErr w:type="gramEnd"/>
-      <w:r>
-        <w:rPr>
-          <w:rFonts w:cs="Courier New"/>
-        </w:rPr>
-        <w:t>(</w:t>
-      </w:r>
-      <w:proofErr w:type="gramStart"/>
-      <w:r>
-        <w:rPr>
-          <w:rFonts w:cs="Courier New"/>
-        </w:rPr>
-        <w:t>).first</w:t>
-      </w:r>
-      <w:proofErr w:type="gramEnd"/>
-      <w:r>
-        <w:rPr>
-          <w:rFonts w:cs="Courier New"/>
-        </w:rPr>
-        <w:t>()</w:t>
+        <w:t xml:space="preserve">        val result = dao.getAll().first()</w:t>
       </w:r>
     </w:p>
     <w:p>
@@ -7559,37 +6972,7 @@
         <w:rPr>
           <w:rFonts w:cs="Courier New"/>
         </w:rPr>
-        <w:t xml:space="preserve">        </w:t>
-      </w:r>
-      <w:proofErr w:type="spellStart"/>
-      <w:r>
-        <w:rPr>
-          <w:rFonts w:cs="Courier New"/>
-        </w:rPr>
-        <w:t>assertTrue</w:t>
-      </w:r>
-      <w:proofErr w:type="spellEnd"/>
-      <w:r>
-        <w:rPr>
-          <w:rFonts w:cs="Courier New"/>
-        </w:rPr>
-        <w:t>(</w:t>
-      </w:r>
-      <w:proofErr w:type="spellStart"/>
-      <w:proofErr w:type="gramStart"/>
-      <w:r>
-        <w:rPr>
-          <w:rFonts w:cs="Courier New"/>
-        </w:rPr>
-        <w:t>result.isNotEmpty</w:t>
-      </w:r>
-      <w:proofErr w:type="spellEnd"/>
-      <w:proofErr w:type="gramEnd"/>
-      <w:r>
-        <w:rPr>
-          <w:rFonts w:cs="Courier New"/>
-        </w:rPr>
-        <w:t>())</w:t>
+        <w:t xml:space="preserve">        assertTrue(result.isNotEmpty())</w:t>
       </w:r>
     </w:p>
     <w:p>
@@ -7609,43 +6992,7 @@
         <w:rPr>
           <w:rFonts w:cs="Courier New"/>
         </w:rPr>
-        <w:t xml:space="preserve">        </w:t>
-      </w:r>
-      <w:proofErr w:type="spellStart"/>
-      <w:proofErr w:type="gramStart"/>
-      <w:r>
-        <w:rPr>
-          <w:rFonts w:cs="Courier New"/>
-        </w:rPr>
-        <w:t>assertEquals</w:t>
-      </w:r>
-      <w:proofErr w:type="spellEnd"/>
-      <w:r>
-        <w:rPr>
-          <w:rFonts w:cs="Courier New"/>
-        </w:rPr>
-        <w:t>(</w:t>
-      </w:r>
-      <w:proofErr w:type="gramEnd"/>
-      <w:r>
-        <w:rPr>
-          <w:rFonts w:cs="Courier New"/>
-        </w:rPr>
-        <w:t>"Test Trip", result[0</w:t>
-      </w:r>
-      <w:proofErr w:type="gramStart"/>
-      <w:r>
-        <w:rPr>
-          <w:rFonts w:cs="Courier New"/>
-        </w:rPr>
-        <w:t>].title</w:t>
-      </w:r>
-      <w:proofErr w:type="gramEnd"/>
-      <w:r>
-        <w:rPr>
-          <w:rFonts w:cs="Courier New"/>
-        </w:rPr>
-        <w:t>)</w:t>
+        <w:t xml:space="preserve">        assertEquals("Test Trip", result[0].title)</w:t>
       </w:r>
     </w:p>
     <w:p>
@@ -7672,7 +7019,7 @@
       <w:pPr>
         <w:pStyle w:val="Heading2"/>
       </w:pPr>
-      <w:bookmarkStart w:id="39" w:name="_Toc233372522"/>
+      <w:bookmarkStart w:id="39" w:name="_Toc233652729"/>
       <w:r>
         <w:t>Test Script 2: Prevent Invalid Budget Input Test</w:t>
       </w:r>
@@ -7693,67 +7040,15 @@
       </w:r>
       <w:r>
         <w:br/>
-        <w:t xml:space="preserve">fun </w:t>
-      </w:r>
-      <w:proofErr w:type="spellStart"/>
-      <w:r>
-        <w:t>invalidBudgetInput_shouldRejectNonNumericValues</w:t>
-      </w:r>
-      <w:proofErr w:type="spellEnd"/>
-      <w:r>
-        <w:t>(){</w:t>
-      </w:r>
-      <w:r>
-        <w:br/>
-        <w:t xml:space="preserve">    </w:t>
-      </w:r>
-      <w:proofErr w:type="spellStart"/>
-      <w:r>
-        <w:t>val</w:t>
-      </w:r>
-      <w:proofErr w:type="spellEnd"/>
-      <w:r>
-        <w:t xml:space="preserve"> </w:t>
-      </w:r>
-      <w:proofErr w:type="spellStart"/>
-      <w:r>
-        <w:t>invalidBudget</w:t>
-      </w:r>
-      <w:proofErr w:type="spellEnd"/>
-      <w:r>
-        <w:t xml:space="preserve"> = "</w:t>
-      </w:r>
-      <w:proofErr w:type="spellStart"/>
-      <w:r>
-        <w:t>abc</w:t>
-      </w:r>
-      <w:proofErr w:type="spellEnd"/>
-      <w:r>
-        <w:t>"</w:t>
-      </w:r>
-      <w:r>
-        <w:br/>
-        <w:t xml:space="preserve">    </w:t>
-      </w:r>
-      <w:proofErr w:type="spellStart"/>
-      <w:r>
-        <w:t>val</w:t>
-      </w:r>
-      <w:proofErr w:type="spellEnd"/>
-      <w:r>
-        <w:t xml:space="preserve"> </w:t>
-      </w:r>
-      <w:proofErr w:type="spellStart"/>
-      <w:r>
-        <w:t>isValid</w:t>
-      </w:r>
-      <w:proofErr w:type="spellEnd"/>
-      <w:r>
-        <w:t xml:space="preserve"> = </w:t>
-      </w:r>
-      <w:proofErr w:type="spellStart"/>
-      <w:r>
-        <w:t>invalidBudget.</w:t>
+        <w:t>fun invalidBudgetInput_shouldRejectNonNumericValues(){</w:t>
+      </w:r>
+      <w:r>
+        <w:br/>
+        <w:t xml:space="preserve">    val invalidBudget = "abc"</w:t>
+      </w:r>
+      <w:r>
+        <w:br/>
+        <w:t xml:space="preserve">    val isValid = invalidBudget.</w:t>
       </w:r>
       <w:r>
         <w:rPr>
@@ -7762,29 +7057,12 @@
         </w:rPr>
         <w:t>toDoubleOrNull</w:t>
       </w:r>
-      <w:proofErr w:type="spellEnd"/>
       <w:r>
         <w:t>() != null</w:t>
       </w:r>
       <w:r>
         <w:br/>
-        <w:t xml:space="preserve">    </w:t>
-      </w:r>
-      <w:proofErr w:type="spellStart"/>
-      <w:r>
-        <w:t>assertFalse</w:t>
-      </w:r>
-      <w:proofErr w:type="spellEnd"/>
-      <w:r>
-        <w:t>(</w:t>
-      </w:r>
-      <w:proofErr w:type="spellStart"/>
-      <w:r>
-        <w:t>isValid</w:t>
-      </w:r>
-      <w:proofErr w:type="spellEnd"/>
-      <w:r>
-        <w:t>)</w:t>
+        <w:t xml:space="preserve">    assertFalse(isValid)</w:t>
       </w:r>
       <w:r>
         <w:br/>
@@ -7799,51 +7077,15 @@
       </w:r>
       <w:r>
         <w:br/>
-        <w:t xml:space="preserve">fun </w:t>
-      </w:r>
-      <w:proofErr w:type="spellStart"/>
-      <w:r>
-        <w:t>invalidBudgetInput_shouldRejectNegativeValues</w:t>
-      </w:r>
-      <w:proofErr w:type="spellEnd"/>
-      <w:r>
-        <w:t>(){</w:t>
-      </w:r>
-      <w:r>
-        <w:br/>
-        <w:t xml:space="preserve">    </w:t>
-      </w:r>
-      <w:proofErr w:type="spellStart"/>
-      <w:r>
-        <w:t>val</w:t>
-      </w:r>
-      <w:proofErr w:type="spellEnd"/>
-      <w:r>
-        <w:t xml:space="preserve"> </w:t>
-      </w:r>
-      <w:proofErr w:type="spellStart"/>
-      <w:r>
-        <w:t>invalidBudget</w:t>
-      </w:r>
-      <w:proofErr w:type="spellEnd"/>
-      <w:r>
-        <w:t xml:space="preserve"> = "-500"</w:t>
-      </w:r>
-      <w:r>
-        <w:br/>
-        <w:t xml:space="preserve">    </w:t>
-      </w:r>
-      <w:proofErr w:type="spellStart"/>
-      <w:r>
-        <w:t>val</w:t>
-      </w:r>
-      <w:proofErr w:type="spellEnd"/>
-      <w:r>
-        <w:t xml:space="preserve"> parsed = </w:t>
-      </w:r>
-      <w:proofErr w:type="spellStart"/>
-      <w:r>
-        <w:t>invalidBudget.</w:t>
+        <w:t>fun invalidBudgetInput_shouldRejectNegativeValues(){</w:t>
+      </w:r>
+      <w:r>
+        <w:br/>
+        <w:t xml:space="preserve">    val invalidBudget = "-500"</w:t>
+      </w:r>
+      <w:r>
+        <w:br/>
+        <w:t xml:space="preserve">    val parsed = invalidBudget.</w:t>
       </w:r>
       <w:r>
         <w:rPr>
@@ -7852,49 +7094,16 @@
         </w:rPr>
         <w:t>toDoubleOrNull</w:t>
       </w:r>
-      <w:proofErr w:type="spellEnd"/>
       <w:r>
         <w:t>()</w:t>
       </w:r>
       <w:r>
         <w:br/>
-        <w:t xml:space="preserve">    </w:t>
-      </w:r>
-      <w:proofErr w:type="spellStart"/>
-      <w:r>
-        <w:t>val</w:t>
-      </w:r>
-      <w:proofErr w:type="spellEnd"/>
-      <w:r>
-        <w:t xml:space="preserve"> </w:t>
-      </w:r>
-      <w:proofErr w:type="spellStart"/>
-      <w:r>
-        <w:t>isValid</w:t>
-      </w:r>
-      <w:proofErr w:type="spellEnd"/>
-      <w:r>
-        <w:t xml:space="preserve"> = parsed != null &amp;&amp; parsed &gt;= 0</w:t>
-      </w:r>
-      <w:r>
-        <w:br/>
-        <w:t xml:space="preserve">    </w:t>
-      </w:r>
-      <w:proofErr w:type="spellStart"/>
-      <w:r>
-        <w:t>assertFalse</w:t>
-      </w:r>
-      <w:proofErr w:type="spellEnd"/>
-      <w:r>
-        <w:t>(</w:t>
-      </w:r>
-      <w:proofErr w:type="spellStart"/>
-      <w:r>
-        <w:t>isValid</w:t>
-      </w:r>
-      <w:proofErr w:type="spellEnd"/>
-      <w:r>
-        <w:t>)</w:t>
+        <w:t xml:space="preserve">    val isValid = parsed != null &amp;&amp; parsed &gt;= 0</w:t>
+      </w:r>
+      <w:r>
+        <w:br/>
+        <w:t xml:space="preserve">    assertFalse(isValid)</w:t>
       </w:r>
       <w:r>
         <w:br/>
@@ -7910,51 +7119,15 @@
       </w:r>
       <w:r>
         <w:br/>
-        <w:t xml:space="preserve">fun </w:t>
-      </w:r>
-      <w:proofErr w:type="spellStart"/>
-      <w:r>
-        <w:t>validBudgetInput_shouldAcceptPositiveNumbers</w:t>
-      </w:r>
-      <w:proofErr w:type="spellEnd"/>
-      <w:r>
-        <w:t>(){</w:t>
-      </w:r>
-      <w:r>
-        <w:br/>
-        <w:t xml:space="preserve">    </w:t>
-      </w:r>
-      <w:proofErr w:type="spellStart"/>
-      <w:r>
-        <w:t>val</w:t>
-      </w:r>
-      <w:proofErr w:type="spellEnd"/>
-      <w:r>
-        <w:t xml:space="preserve"> </w:t>
-      </w:r>
-      <w:proofErr w:type="spellStart"/>
-      <w:r>
-        <w:t>validBudget</w:t>
-      </w:r>
-      <w:proofErr w:type="spellEnd"/>
-      <w:r>
-        <w:t xml:space="preserve"> = "3000"</w:t>
-      </w:r>
-      <w:r>
-        <w:br/>
-        <w:t xml:space="preserve">    </w:t>
-      </w:r>
-      <w:proofErr w:type="spellStart"/>
-      <w:r>
-        <w:t>val</w:t>
-      </w:r>
-      <w:proofErr w:type="spellEnd"/>
-      <w:r>
-        <w:t xml:space="preserve"> parsed = </w:t>
-      </w:r>
-      <w:proofErr w:type="spellStart"/>
-      <w:r>
-        <w:t>validBudget.</w:t>
+        <w:t>fun validBudgetInput_shouldAcceptPositiveNumbers(){</w:t>
+      </w:r>
+      <w:r>
+        <w:br/>
+        <w:t xml:space="preserve">    val validBudget = "3000"</w:t>
+      </w:r>
+      <w:r>
+        <w:br/>
+        <w:t xml:space="preserve">    val parsed = validBudget.</w:t>
       </w:r>
       <w:r>
         <w:rPr>
@@ -7963,49 +7136,16 @@
         </w:rPr>
         <w:t>toDoubleOrNull</w:t>
       </w:r>
-      <w:proofErr w:type="spellEnd"/>
       <w:r>
         <w:t>()</w:t>
       </w:r>
       <w:r>
         <w:br/>
-        <w:t xml:space="preserve">    </w:t>
-      </w:r>
-      <w:proofErr w:type="spellStart"/>
-      <w:r>
-        <w:t>val</w:t>
-      </w:r>
-      <w:proofErr w:type="spellEnd"/>
-      <w:r>
-        <w:t xml:space="preserve"> </w:t>
-      </w:r>
-      <w:proofErr w:type="spellStart"/>
-      <w:r>
-        <w:t>isValid</w:t>
-      </w:r>
-      <w:proofErr w:type="spellEnd"/>
-      <w:r>
-        <w:t xml:space="preserve"> = parsed != null &amp;&amp; parsed &gt;= 0</w:t>
-      </w:r>
-      <w:r>
-        <w:br/>
-        <w:t xml:space="preserve">    </w:t>
-      </w:r>
-      <w:proofErr w:type="spellStart"/>
-      <w:r>
-        <w:t>assertTrue</w:t>
-      </w:r>
-      <w:proofErr w:type="spellEnd"/>
-      <w:r>
-        <w:t>(</w:t>
-      </w:r>
-      <w:proofErr w:type="spellStart"/>
-      <w:r>
-        <w:t>isValid</w:t>
-      </w:r>
-      <w:proofErr w:type="spellEnd"/>
-      <w:r>
-        <w:t>)</w:t>
+        <w:t xml:space="preserve">    val isValid = parsed != null &amp;&amp; parsed &gt;= 0</w:t>
+      </w:r>
+      <w:r>
+        <w:br/>
+        <w:t xml:space="preserve">    assertTrue(isValid)</w:t>
       </w:r>
       <w:r>
         <w:br/>
@@ -8020,27 +7160,11 @@
       </w:r>
       <w:r>
         <w:br/>
-        <w:t xml:space="preserve">fun </w:t>
-      </w:r>
-      <w:proofErr w:type="spellStart"/>
-      <w:r>
-        <w:t>vacationEntity_shouldNotSaveInvalidBudget</w:t>
-      </w:r>
-      <w:proofErr w:type="spellEnd"/>
-      <w:r>
-        <w:t>(){</w:t>
-      </w:r>
-      <w:r>
-        <w:br/>
-        <w:t xml:space="preserve">    </w:t>
-      </w:r>
-      <w:proofErr w:type="spellStart"/>
-      <w:r>
-        <w:t>val</w:t>
-      </w:r>
-      <w:proofErr w:type="spellEnd"/>
-      <w:r>
-        <w:t xml:space="preserve"> vacation = Vacation(</w:t>
+        <w:t>fun vacationEntity_shouldNotSaveInvalidBudget(){</w:t>
+      </w:r>
+      <w:r>
+        <w:br/>
+        <w:t xml:space="preserve">    val vacation = Vacation(</w:t>
       </w:r>
       <w:r>
         <w:br/>
@@ -8056,39 +7180,15 @@
       </w:r>
       <w:r>
         <w:br/>
-        <w:t xml:space="preserve">        </w:t>
-      </w:r>
-      <w:proofErr w:type="spellStart"/>
-      <w:r>
-        <w:t>hotelCost</w:t>
-      </w:r>
-      <w:proofErr w:type="spellEnd"/>
-      <w:r>
-        <w:t xml:space="preserve"> = 300.0,</w:t>
-      </w:r>
-      <w:r>
-        <w:br/>
-        <w:t xml:space="preserve">        </w:t>
-      </w:r>
-      <w:proofErr w:type="spellStart"/>
-      <w:r>
-        <w:t>startDate</w:t>
-      </w:r>
-      <w:proofErr w:type="spellEnd"/>
-      <w:r>
-        <w:t xml:space="preserve"> = "01/01/2026",</w:t>
-      </w:r>
-      <w:r>
-        <w:br/>
-        <w:t xml:space="preserve">        </w:t>
-      </w:r>
-      <w:proofErr w:type="spellStart"/>
-      <w:r>
-        <w:t>endDate</w:t>
-      </w:r>
-      <w:proofErr w:type="spellEnd"/>
-      <w:r>
-        <w:t xml:space="preserve"> = "06/30/2026",</w:t>
+        <w:t xml:space="preserve">        hotelCost = 300.0,</w:t>
+      </w:r>
+      <w:r>
+        <w:br/>
+        <w:t xml:space="preserve">        startDate = "01/01/2026",</w:t>
+      </w:r>
+      <w:r>
+        <w:br/>
+        <w:t xml:space="preserve">        endDate = "06/30/2026",</w:t>
       </w:r>
       <w:r>
         <w:br/>
@@ -8096,17 +7196,8 @@
       </w:r>
       <w:r>
         <w:br/>
-        <w:t xml:space="preserve">        </w:t>
-      </w:r>
-      <w:proofErr w:type="spellStart"/>
-      <w:r>
-        <w:t>reminderDays</w:t>
-      </w:r>
-      <w:proofErr w:type="spellEnd"/>
-      <w:r>
-        <w:t xml:space="preserve"> = </w:t>
-      </w:r>
-      <w:proofErr w:type="spellStart"/>
+        <w:t xml:space="preserve">        reminderDays = </w:t>
+      </w:r>
       <w:r>
         <w:rPr>
           <w:i/>
@@ -8114,21 +7205,12 @@
         </w:rPr>
         <w:t>listOf</w:t>
       </w:r>
-      <w:proofErr w:type="spellEnd"/>
       <w:r>
         <w:t>(1, 3),</w:t>
       </w:r>
       <w:r>
         <w:br/>
-        <w:t xml:space="preserve">        </w:t>
-      </w:r>
-      <w:proofErr w:type="spellStart"/>
-      <w:r>
-        <w:t>isFavorite</w:t>
-      </w:r>
-      <w:proofErr w:type="spellEnd"/>
-      <w:r>
-        <w:t xml:space="preserve"> = false</w:t>
+        <w:t xml:space="preserve">        isFavorite = false</w:t>
       </w:r>
       <w:r>
         <w:br/>
@@ -8139,51 +7221,11 @@
       </w:r>
       <w:r>
         <w:br/>
-        <w:t xml:space="preserve">    </w:t>
-      </w:r>
-      <w:proofErr w:type="spellStart"/>
-      <w:r>
-        <w:t>val</w:t>
-      </w:r>
-      <w:proofErr w:type="spellEnd"/>
-      <w:r>
-        <w:t xml:space="preserve"> </w:t>
-      </w:r>
-      <w:proofErr w:type="spellStart"/>
-      <w:r>
-        <w:t>isValid</w:t>
-      </w:r>
-      <w:proofErr w:type="spellEnd"/>
-      <w:r>
-        <w:t xml:space="preserve"> = </w:t>
-      </w:r>
-      <w:proofErr w:type="spellStart"/>
-      <w:r>
-        <w:t>vacation.budget</w:t>
-      </w:r>
-      <w:proofErr w:type="spellEnd"/>
-      <w:r>
-        <w:t xml:space="preserve"> &gt;= 0</w:t>
-      </w:r>
-      <w:r>
-        <w:br/>
-        <w:t xml:space="preserve">    </w:t>
-      </w:r>
-      <w:proofErr w:type="spellStart"/>
-      <w:r>
-        <w:t>assertFalse</w:t>
-      </w:r>
-      <w:proofErr w:type="spellEnd"/>
-      <w:r>
-        <w:t xml:space="preserve">("Vacation should not save with negative budget", </w:t>
-      </w:r>
-      <w:proofErr w:type="spellStart"/>
-      <w:r>
-        <w:t>isValid</w:t>
-      </w:r>
-      <w:proofErr w:type="spellEnd"/>
-      <w:r>
-        <w:t>)</w:t>
+        <w:t xml:space="preserve">    val isValid = vacation.budget &gt;= 0</w:t>
+      </w:r>
+      <w:r>
+        <w:br/>
+        <w:t xml:space="preserve">    assertFalse("Vacation should not save with negative budget", isValid)</w:t>
       </w:r>
       <w:r>
         <w:br/>
@@ -8205,7 +7247,7 @@
       <w:pPr>
         <w:pStyle w:val="Heading2"/>
       </w:pPr>
-      <w:bookmarkStart w:id="40" w:name="_Toc233372523"/>
+      <w:bookmarkStart w:id="40" w:name="_Toc233652730"/>
       <w:r>
         <w:t>Test Script 3: Delete Vacation Test</w:t>
       </w:r>
@@ -8222,46 +7264,12 @@
         <w:shd w:val="clear" w:color="auto" w:fill="D1D1D1" w:themeFill="background2" w:themeFillShade="E6"/>
       </w:pPr>
       <w:r>
-        <w:t xml:space="preserve">private </w:t>
-      </w:r>
-      <w:proofErr w:type="spellStart"/>
-      <w:r>
-        <w:t>lateinit</w:t>
-      </w:r>
-      <w:proofErr w:type="spellEnd"/>
-      <w:r>
-        <w:t xml:space="preserve"> var </w:t>
-      </w:r>
-      <w:proofErr w:type="spellStart"/>
-      <w:r>
-        <w:t>db</w:t>
-      </w:r>
-      <w:proofErr w:type="spellEnd"/>
-      <w:r>
-        <w:t xml:space="preserve">: </w:t>
-      </w:r>
-      <w:proofErr w:type="spellStart"/>
-      <w:r>
-        <w:t>VacationDatabase</w:t>
-      </w:r>
-      <w:proofErr w:type="spellEnd"/>
-      <w:r>
-        <w:br/>
-        <w:t xml:space="preserve">private </w:t>
-      </w:r>
-      <w:proofErr w:type="spellStart"/>
-      <w:r>
-        <w:t>lateinit</w:t>
-      </w:r>
-      <w:proofErr w:type="spellEnd"/>
-      <w:r>
-        <w:t xml:space="preserve"> var dao: </w:t>
-      </w:r>
-      <w:proofErr w:type="spellStart"/>
-      <w:r>
-        <w:t>VacationDao</w:t>
-      </w:r>
-      <w:proofErr w:type="spellEnd"/>
+        <w:t>private lateinit var db: VacationDatabase</w:t>
+      </w:r>
+      <w:r>
+        <w:br/>
+        <w:t>private lateinit var dao: VacationDao</w:t>
+      </w:r>
       <w:r>
         <w:br/>
       </w:r>
@@ -8275,47 +7283,15 @@
       </w:r>
       <w:r>
         <w:br/>
-        <w:t xml:space="preserve">    </w:t>
-      </w:r>
-      <w:proofErr w:type="spellStart"/>
-      <w:r>
-        <w:t>db</w:t>
-      </w:r>
-      <w:proofErr w:type="spellEnd"/>
-      <w:r>
-        <w:t xml:space="preserve"> = </w:t>
-      </w:r>
-      <w:proofErr w:type="spellStart"/>
-      <w:r>
-        <w:t>Room.inMemoryDatabaseBuilder</w:t>
-      </w:r>
-      <w:proofErr w:type="spellEnd"/>
-      <w:r>
-        <w:t>(</w:t>
-      </w:r>
-      <w:r>
-        <w:br/>
-        <w:t xml:space="preserve">        </w:t>
-      </w:r>
-      <w:proofErr w:type="spellStart"/>
-      <w:r>
-        <w:t>ApplicationProvider.getApplicationContext</w:t>
-      </w:r>
-      <w:proofErr w:type="spellEnd"/>
-      <w:r>
-        <w:t>(),</w:t>
-      </w:r>
-      <w:r>
-        <w:br/>
-        <w:t xml:space="preserve">        </w:t>
-      </w:r>
-      <w:proofErr w:type="spellStart"/>
-      <w:r>
-        <w:t>VacationDatabase</w:t>
-      </w:r>
-      <w:proofErr w:type="spellEnd"/>
-      <w:r>
-        <w:t>::class.</w:t>
+        <w:t xml:space="preserve">    db = Room.inMemoryDatabaseBuilder(</w:t>
+      </w:r>
+      <w:r>
+        <w:br/>
+        <w:t xml:space="preserve">        ApplicationProvider.getApplicationContext(),</w:t>
+      </w:r>
+      <w:r>
+        <w:br/>
+        <w:t xml:space="preserve">        VacationDatabase::class.</w:t>
       </w:r>
       <w:r>
         <w:rPr>
@@ -8340,30 +7316,14 @@
         <w:t xml:space="preserve">    </w:t>
       </w:r>
       <w:r>
-        <w:t>).</w:t>
-      </w:r>
-      <w:proofErr w:type="spellStart"/>
-      <w:r>
-        <w:t>allowMainThreadQueries</w:t>
-      </w:r>
-      <w:proofErr w:type="spellEnd"/>
-      <w:r>
-        <w:t>().build()</w:t>
-      </w:r>
-      <w:r>
-        <w:br/>
-      </w:r>
-      <w:r>
-        <w:br/>
-        <w:t xml:space="preserve">    dao = </w:t>
-      </w:r>
-      <w:proofErr w:type="spellStart"/>
-      <w:r>
-        <w:t>db.vacationDao</w:t>
-      </w:r>
-      <w:proofErr w:type="spellEnd"/>
-      <w:r>
-        <w:t>()</w:t>
+        <w:t>).allowMainThreadQueries().build()</w:t>
+      </w:r>
+      <w:r>
+        <w:br/>
+      </w:r>
+      <w:r>
+        <w:br/>
+        <w:t xml:space="preserve">    dao = db.vacationDao()</w:t>
       </w:r>
       <w:r>
         <w:br/>
@@ -8382,15 +7342,7 @@
       </w:r>
       <w:r>
         <w:br/>
-        <w:t xml:space="preserve">    </w:t>
-      </w:r>
-      <w:proofErr w:type="spellStart"/>
-      <w:r>
-        <w:t>db.close</w:t>
-      </w:r>
-      <w:proofErr w:type="spellEnd"/>
-      <w:r>
-        <w:t>()</w:t>
+        <w:t xml:space="preserve">    db.close()</w:t>
       </w:r>
       <w:r>
         <w:br/>
@@ -8405,62 +7357,21 @@
       </w:r>
       <w:r>
         <w:br/>
-        <w:t xml:space="preserve">fun </w:t>
-      </w:r>
-      <w:proofErr w:type="spellStart"/>
-      <w:r>
-        <w:t>deleteVacation_removesEntryWhenNoExcursionExist</w:t>
-      </w:r>
-      <w:proofErr w:type="spellEnd"/>
-      <w:r>
-        <w:t xml:space="preserve">() = </w:t>
-      </w:r>
-      <w:proofErr w:type="spellStart"/>
+        <w:t xml:space="preserve">fun deleteVacation_removesEntryWhenNoExcursionExist() = </w:t>
+      </w:r>
       <w:r>
         <w:rPr>
           <w:i/>
           <w:iCs/>
         </w:rPr>
-        <w:t>runTest</w:t>
-      </w:r>
-      <w:proofErr w:type="spellEnd"/>
-      <w:r>
-        <w:rPr>
-          <w:i/>
-          <w:iCs/>
-        </w:rPr>
-        <w:t xml:space="preserve"> </w:t>
+        <w:t xml:space="preserve">runTest </w:t>
       </w:r>
       <w:r>
         <w:t>{</w:t>
       </w:r>
       <w:r>
         <w:br/>
-        <w:t xml:space="preserve">    </w:t>
-      </w:r>
-      <w:proofErr w:type="spellStart"/>
-      <w:r>
-        <w:t>val</w:t>
-      </w:r>
-      <w:proofErr w:type="spellEnd"/>
-      <w:r>
-        <w:t xml:space="preserve"> </w:t>
-      </w:r>
-      <w:proofErr w:type="spellStart"/>
-      <w:r>
-        <w:t>vacationId</w:t>
-      </w:r>
-      <w:proofErr w:type="spellEnd"/>
-      <w:r>
-        <w:t xml:space="preserve"> = </w:t>
-      </w:r>
-      <w:proofErr w:type="spellStart"/>
-      <w:r>
-        <w:t>dao.insert</w:t>
-      </w:r>
-      <w:proofErr w:type="spellEnd"/>
-      <w:r>
-        <w:t>(</w:t>
+        <w:t xml:space="preserve">    val vacationId = dao.insert(</w:t>
       </w:r>
       <w:r>
         <w:br/>
@@ -8480,39 +7391,15 @@
       </w:r>
       <w:r>
         <w:br/>
-        <w:t xml:space="preserve">            </w:t>
-      </w:r>
-      <w:proofErr w:type="spellStart"/>
-      <w:r>
-        <w:t>hotelCost</w:t>
-      </w:r>
-      <w:proofErr w:type="spellEnd"/>
-      <w:r>
-        <w:t xml:space="preserve"> = 200.0,</w:t>
-      </w:r>
-      <w:r>
-        <w:br/>
-        <w:t xml:space="preserve">            </w:t>
-      </w:r>
-      <w:proofErr w:type="spellStart"/>
-      <w:r>
-        <w:t>startDate</w:t>
-      </w:r>
-      <w:proofErr w:type="spellEnd"/>
-      <w:r>
-        <w:t xml:space="preserve"> = "01/01/2026",</w:t>
-      </w:r>
-      <w:r>
-        <w:br/>
-        <w:t xml:space="preserve">            </w:t>
-      </w:r>
-      <w:proofErr w:type="spellStart"/>
-      <w:r>
-        <w:t>endDate</w:t>
-      </w:r>
-      <w:proofErr w:type="spellEnd"/>
-      <w:r>
-        <w:t xml:space="preserve"> = "06/30/2026",</w:t>
+        <w:t xml:space="preserve">            hotelCost = 200.0,</w:t>
+      </w:r>
+      <w:r>
+        <w:br/>
+        <w:t xml:space="preserve">            startDate = "01/01/2026",</w:t>
+      </w:r>
+      <w:r>
+        <w:br/>
+        <w:t xml:space="preserve">            endDate = "06/30/2026",</w:t>
       </w:r>
       <w:r>
         <w:br/>
@@ -8520,17 +7407,8 @@
       </w:r>
       <w:r>
         <w:br/>
-        <w:t xml:space="preserve">            </w:t>
-      </w:r>
-      <w:proofErr w:type="spellStart"/>
-      <w:r>
-        <w:t>reminderDays</w:t>
-      </w:r>
-      <w:proofErr w:type="spellEnd"/>
-      <w:r>
-        <w:t xml:space="preserve"> = </w:t>
-      </w:r>
-      <w:proofErr w:type="spellStart"/>
+        <w:t xml:space="preserve">            reminderDays = </w:t>
+      </w:r>
       <w:r>
         <w:rPr>
           <w:i/>
@@ -8538,21 +7416,12 @@
         </w:rPr>
         <w:t>listOf</w:t>
       </w:r>
-      <w:proofErr w:type="spellEnd"/>
       <w:r>
         <w:t>(),</w:t>
       </w:r>
       <w:r>
         <w:br/>
-        <w:t xml:space="preserve">            </w:t>
-      </w:r>
-      <w:proofErr w:type="spellStart"/>
-      <w:r>
-        <w:t>isFavorite</w:t>
-      </w:r>
-      <w:proofErr w:type="spellEnd"/>
-      <w:r>
-        <w:t xml:space="preserve"> = false</w:t>
+        <w:t xml:space="preserve">            isFavorite = false</w:t>
       </w:r>
       <w:r>
         <w:br/>
@@ -8567,100 +7436,35 @@
       </w:r>
       <w:r>
         <w:br/>
+        <w:t xml:space="preserve">    val vacation = dao.getVacationById(vacationId).first()!!</w:t>
+      </w:r>
+      <w:r>
+        <w:br/>
+      </w:r>
+      <w:r>
+        <w:br/>
+        <w:t xml:space="preserve">    dao.delete(vacation)</w:t>
+      </w:r>
+      <w:r>
+        <w:br/>
+      </w:r>
+      <w:r>
+        <w:br/>
+        <w:t xml:space="preserve">    val result = dao.getAll().first()</w:t>
+      </w:r>
+      <w:r>
+        <w:br/>
         <w:t xml:space="preserve">    </w:t>
       </w:r>
-      <w:proofErr w:type="spellStart"/>
-      <w:r>
-        <w:t>val</w:t>
-      </w:r>
-      <w:proofErr w:type="spellEnd"/>
-      <w:r>
-        <w:t xml:space="preserve"> vacation = </w:t>
-      </w:r>
-      <w:proofErr w:type="spellStart"/>
-      <w:r>
-        <w:t>dao.getVacationById</w:t>
-      </w:r>
-      <w:proofErr w:type="spellEnd"/>
-      <w:r>
-        <w:t>(</w:t>
-      </w:r>
-      <w:proofErr w:type="spellStart"/>
-      <w:r>
-        <w:t>vacationId</w:t>
-      </w:r>
-      <w:proofErr w:type="spellEnd"/>
-      <w:r>
-        <w:t>).first()!!</w:t>
-      </w:r>
-      <w:r>
-        <w:br/>
-      </w:r>
-      <w:r>
-        <w:br/>
-        <w:t xml:space="preserve">    </w:t>
-      </w:r>
-      <w:proofErr w:type="spellStart"/>
-      <w:r>
-        <w:t>dao.delete</w:t>
-      </w:r>
-      <w:proofErr w:type="spellEnd"/>
-      <w:r>
-        <w:t>(vacation)</w:t>
-      </w:r>
-      <w:r>
-        <w:br/>
-      </w:r>
-      <w:r>
-        <w:br/>
-        <w:t xml:space="preserve">    </w:t>
-      </w:r>
-      <w:proofErr w:type="spellStart"/>
-      <w:r>
-        <w:t>val</w:t>
-      </w:r>
-      <w:proofErr w:type="spellEnd"/>
-      <w:r>
-        <w:t xml:space="preserve"> result = </w:t>
-      </w:r>
-      <w:proofErr w:type="spellStart"/>
-      <w:r>
-        <w:t>dao.getAll</w:t>
-      </w:r>
-      <w:proofErr w:type="spellEnd"/>
-      <w:r>
-        <w:t>().first()</w:t>
-      </w:r>
-      <w:r>
-        <w:br/>
-        <w:t xml:space="preserve">    </w:t>
-      </w:r>
-      <w:proofErr w:type="spellStart"/>
       <w:r>
         <w:rPr>
           <w:i/>
           <w:iCs/>
         </w:rPr>
-        <w:t>assertTrue</w:t>
-      </w:r>
-      <w:proofErr w:type="spellEnd"/>
-      <w:r>
-        <w:rPr>
-          <w:i/>
-          <w:iCs/>
-        </w:rPr>
-        <w:t xml:space="preserve"> </w:t>
-      </w:r>
-      <w:r>
-        <w:t xml:space="preserve">{ </w:t>
-      </w:r>
-      <w:proofErr w:type="spellStart"/>
-      <w:r>
-        <w:t>result.isEmpty</w:t>
-      </w:r>
-      <w:proofErr w:type="spellEnd"/>
-      <w:r>
-        <w:t>() }</w:t>
+        <w:t xml:space="preserve">assertTrue </w:t>
+      </w:r>
+      <w:r>
+        <w:t>{ result.isEmpty() }</w:t>
       </w:r>
       <w:r>
         <w:br/>
@@ -8671,7 +7475,7 @@
       <w:pPr>
         <w:pStyle w:val="Heading2"/>
       </w:pPr>
-      <w:bookmarkStart w:id="41" w:name="_Toc233372524"/>
+      <w:bookmarkStart w:id="41" w:name="_Toc233652731"/>
       <w:r>
         <w:t>Test Script 4: Add Excursion Test</w:t>
       </w:r>
@@ -8688,79 +7492,16 @@
         <w:shd w:val="clear" w:color="auto" w:fill="D1D1D1" w:themeFill="background2" w:themeFillShade="E6"/>
       </w:pPr>
       <w:r>
-        <w:t xml:space="preserve">private </w:t>
-      </w:r>
-      <w:proofErr w:type="spellStart"/>
-      <w:r>
-        <w:t>lateinit</w:t>
-      </w:r>
-      <w:proofErr w:type="spellEnd"/>
-      <w:r>
-        <w:t xml:space="preserve"> var </w:t>
-      </w:r>
-      <w:proofErr w:type="spellStart"/>
-      <w:r>
-        <w:t>db</w:t>
-      </w:r>
-      <w:proofErr w:type="spellEnd"/>
-      <w:r>
-        <w:t xml:space="preserve">: </w:t>
-      </w:r>
-      <w:proofErr w:type="spellStart"/>
-      <w:r>
-        <w:t>VacationDatabase</w:t>
-      </w:r>
-      <w:proofErr w:type="spellEnd"/>
-      <w:r>
-        <w:br/>
-        <w:t xml:space="preserve">private </w:t>
-      </w:r>
-      <w:proofErr w:type="spellStart"/>
-      <w:r>
-        <w:t>lateinit</w:t>
-      </w:r>
-      <w:proofErr w:type="spellEnd"/>
-      <w:r>
-        <w:t xml:space="preserve"> var </w:t>
-      </w:r>
-      <w:proofErr w:type="spellStart"/>
-      <w:r>
-        <w:t>vacationDao</w:t>
-      </w:r>
-      <w:proofErr w:type="spellEnd"/>
-      <w:r>
-        <w:t xml:space="preserve">: </w:t>
-      </w:r>
-      <w:proofErr w:type="spellStart"/>
-      <w:r>
-        <w:t>VacationDao</w:t>
-      </w:r>
-      <w:proofErr w:type="spellEnd"/>
-      <w:r>
-        <w:br/>
-        <w:t xml:space="preserve">private </w:t>
-      </w:r>
-      <w:proofErr w:type="spellStart"/>
-      <w:r>
-        <w:t>lateinit</w:t>
-      </w:r>
-      <w:proofErr w:type="spellEnd"/>
-      <w:r>
-        <w:t xml:space="preserve"> var </w:t>
-      </w:r>
-      <w:proofErr w:type="spellStart"/>
-      <w:r>
-        <w:t>excursionDao</w:t>
-      </w:r>
-      <w:proofErr w:type="spellEnd"/>
-      <w:r>
-        <w:t xml:space="preserve">: </w:t>
-      </w:r>
-      <w:proofErr w:type="spellStart"/>
-      <w:r>
-        <w:t>ExcursionDao</w:t>
-      </w:r>
-      <w:proofErr w:type="spellEnd"/>
+        <w:t>private lateinit var db: VacationDatabase</w:t>
+      </w:r>
+      <w:r>
+        <w:br/>
+        <w:t>private lateinit var vacationDao: VacationDao</w:t>
+      </w:r>
+      <w:r>
+        <w:br/>
+        <w:t>private lateinit var excursionDao: ExcursionDao</w:t>
+      </w:r>
       <w:r>
         <w:br/>
       </w:r>
@@ -8775,47 +7516,15 @@
       </w:r>
       <w:r>
         <w:br/>
-        <w:t xml:space="preserve">    </w:t>
-      </w:r>
-      <w:proofErr w:type="spellStart"/>
-      <w:r>
-        <w:t>db</w:t>
-      </w:r>
-      <w:proofErr w:type="spellEnd"/>
-      <w:r>
-        <w:t xml:space="preserve"> = </w:t>
-      </w:r>
-      <w:proofErr w:type="spellStart"/>
-      <w:r>
-        <w:t>Room.inMemoryDatabaseBuilder</w:t>
-      </w:r>
-      <w:proofErr w:type="spellEnd"/>
-      <w:r>
-        <w:t>(</w:t>
-      </w:r>
-      <w:r>
-        <w:br/>
-        <w:t xml:space="preserve">        </w:t>
-      </w:r>
-      <w:proofErr w:type="spellStart"/>
-      <w:r>
-        <w:t>ApplicationProvider.getApplicationContext</w:t>
-      </w:r>
-      <w:proofErr w:type="spellEnd"/>
-      <w:r>
-        <w:t>(),</w:t>
-      </w:r>
-      <w:r>
-        <w:br/>
-        <w:t xml:space="preserve">        </w:t>
-      </w:r>
-      <w:proofErr w:type="spellStart"/>
-      <w:r>
-        <w:t>VacationDatabase</w:t>
-      </w:r>
-      <w:proofErr w:type="spellEnd"/>
-      <w:r>
-        <w:t>::class.</w:t>
+        <w:t xml:space="preserve">    db = Room.inMemoryDatabaseBuilder(</w:t>
+      </w:r>
+      <w:r>
+        <w:br/>
+        <w:t xml:space="preserve">        ApplicationProvider.getApplicationContext(),</w:t>
+      </w:r>
+      <w:r>
+        <w:br/>
+        <w:t xml:space="preserve">        VacationDatabase::class.</w:t>
       </w:r>
       <w:r>
         <w:rPr>
@@ -8833,58 +7542,18 @@
         <w:t xml:space="preserve">    </w:t>
       </w:r>
       <w:r>
-        <w:t>).</w:t>
-      </w:r>
-      <w:proofErr w:type="spellStart"/>
-      <w:r>
-        <w:t>allowMainThreadQueries</w:t>
-      </w:r>
-      <w:proofErr w:type="spellEnd"/>
-      <w:r>
-        <w:t>().build()</w:t>
-      </w:r>
-      <w:r>
-        <w:br/>
-      </w:r>
-      <w:r>
-        <w:br/>
-        <w:t xml:space="preserve">    </w:t>
-      </w:r>
-      <w:proofErr w:type="spellStart"/>
-      <w:r>
-        <w:t>vacationDao</w:t>
-      </w:r>
-      <w:proofErr w:type="spellEnd"/>
-      <w:r>
-        <w:t xml:space="preserve"> = </w:t>
-      </w:r>
-      <w:proofErr w:type="spellStart"/>
-      <w:r>
-        <w:t>db.vacationDao</w:t>
-      </w:r>
-      <w:proofErr w:type="spellEnd"/>
-      <w:r>
-        <w:t>()</w:t>
-      </w:r>
-      <w:r>
-        <w:br/>
-        <w:t xml:space="preserve">    </w:t>
-      </w:r>
-      <w:proofErr w:type="spellStart"/>
-      <w:r>
-        <w:t>excursionDao</w:t>
-      </w:r>
-      <w:proofErr w:type="spellEnd"/>
-      <w:r>
-        <w:t xml:space="preserve"> = </w:t>
-      </w:r>
-      <w:proofErr w:type="spellStart"/>
-      <w:r>
-        <w:t>db.excursionDao</w:t>
-      </w:r>
-      <w:proofErr w:type="spellEnd"/>
-      <w:r>
-        <w:t>()</w:t>
+        <w:t>).allowMainThreadQueries().build()</w:t>
+      </w:r>
+      <w:r>
+        <w:br/>
+      </w:r>
+      <w:r>
+        <w:br/>
+        <w:t xml:space="preserve">    vacationDao = db.vacationDao()</w:t>
+      </w:r>
+      <w:r>
+        <w:br/>
+        <w:t xml:space="preserve">    excursionDao = db.excursionDao()</w:t>
       </w:r>
       <w:r>
         <w:br/>
@@ -8903,15 +7572,7 @@
       </w:r>
       <w:r>
         <w:br/>
-        <w:t xml:space="preserve">    </w:t>
-      </w:r>
-      <w:proofErr w:type="spellStart"/>
-      <w:r>
-        <w:t>db.close</w:t>
-      </w:r>
-      <w:proofErr w:type="spellEnd"/>
-      <w:r>
-        <w:t>()</w:t>
+        <w:t xml:space="preserve">    db.close()</w:t>
       </w:r>
       <w:r>
         <w:br/>
@@ -8926,62 +7587,21 @@
       </w:r>
       <w:r>
         <w:br/>
-        <w:t xml:space="preserve">fun </w:t>
-      </w:r>
-      <w:proofErr w:type="spellStart"/>
-      <w:r>
-        <w:t>addExcursion_savesToCorrectVacation</w:t>
-      </w:r>
-      <w:proofErr w:type="spellEnd"/>
-      <w:r>
-        <w:t xml:space="preserve">() = </w:t>
-      </w:r>
-      <w:proofErr w:type="spellStart"/>
+        <w:t xml:space="preserve">fun addExcursion_savesToCorrectVacation() = </w:t>
+      </w:r>
       <w:r>
         <w:rPr>
           <w:i/>
           <w:iCs/>
         </w:rPr>
-        <w:t>runTest</w:t>
-      </w:r>
-      <w:proofErr w:type="spellEnd"/>
-      <w:r>
-        <w:rPr>
-          <w:i/>
-          <w:iCs/>
-        </w:rPr>
-        <w:t xml:space="preserve"> </w:t>
+        <w:t xml:space="preserve">runTest </w:t>
       </w:r>
       <w:r>
         <w:t>{</w:t>
       </w:r>
       <w:r>
         <w:br/>
-        <w:t xml:space="preserve">    </w:t>
-      </w:r>
-      <w:proofErr w:type="spellStart"/>
-      <w:r>
-        <w:t>val</w:t>
-      </w:r>
-      <w:proofErr w:type="spellEnd"/>
-      <w:r>
-        <w:t xml:space="preserve"> </w:t>
-      </w:r>
-      <w:proofErr w:type="spellStart"/>
-      <w:r>
-        <w:t>vacationId</w:t>
-      </w:r>
-      <w:proofErr w:type="spellEnd"/>
-      <w:r>
-        <w:t xml:space="preserve"> = </w:t>
-      </w:r>
-      <w:proofErr w:type="spellStart"/>
-      <w:r>
-        <w:t>vacationDao.insert</w:t>
-      </w:r>
-      <w:proofErr w:type="spellEnd"/>
-      <w:r>
-        <w:t>(</w:t>
+        <w:t xml:space="preserve">    val vacationId = vacationDao.insert(</w:t>
       </w:r>
       <w:r>
         <w:br/>
@@ -9001,39 +7621,15 @@
       </w:r>
       <w:r>
         <w:br/>
-        <w:t xml:space="preserve">            </w:t>
-      </w:r>
-      <w:proofErr w:type="spellStart"/>
-      <w:r>
-        <w:t>hotelCost</w:t>
-      </w:r>
-      <w:proofErr w:type="spellEnd"/>
-      <w:r>
-        <w:t xml:space="preserve"> = 150.0,</w:t>
-      </w:r>
-      <w:r>
-        <w:br/>
-        <w:t xml:space="preserve">            </w:t>
-      </w:r>
-      <w:proofErr w:type="spellStart"/>
-      <w:r>
-        <w:t>startDate</w:t>
-      </w:r>
-      <w:proofErr w:type="spellEnd"/>
-      <w:r>
-        <w:t xml:space="preserve"> = "07/01/2026",</w:t>
-      </w:r>
-      <w:r>
-        <w:br/>
-        <w:t xml:space="preserve">            </w:t>
-      </w:r>
-      <w:proofErr w:type="spellStart"/>
-      <w:r>
-        <w:t>endDate</w:t>
-      </w:r>
-      <w:proofErr w:type="spellEnd"/>
-      <w:r>
-        <w:t xml:space="preserve"> = "08/01/2026",</w:t>
+        <w:t xml:space="preserve">            hotelCost = 150.0,</w:t>
+      </w:r>
+      <w:r>
+        <w:br/>
+        <w:t xml:space="preserve">            startDate = "07/01/2026",</w:t>
+      </w:r>
+      <w:r>
+        <w:br/>
+        <w:t xml:space="preserve">            endDate = "08/01/2026",</w:t>
       </w:r>
       <w:r>
         <w:br/>
@@ -9041,17 +7637,8 @@
       </w:r>
       <w:r>
         <w:br/>
-        <w:t xml:space="preserve">            </w:t>
-      </w:r>
-      <w:proofErr w:type="spellStart"/>
-      <w:r>
-        <w:t>reminderDays</w:t>
-      </w:r>
-      <w:proofErr w:type="spellEnd"/>
-      <w:r>
-        <w:t xml:space="preserve"> = </w:t>
-      </w:r>
-      <w:proofErr w:type="spellStart"/>
+        <w:t xml:space="preserve">            reminderDays = </w:t>
+      </w:r>
       <w:r>
         <w:rPr>
           <w:i/>
@@ -9059,21 +7646,12 @@
         </w:rPr>
         <w:t>listOf</w:t>
       </w:r>
-      <w:proofErr w:type="spellEnd"/>
       <w:r>
         <w:t>(1,3),</w:t>
       </w:r>
       <w:r>
         <w:br/>
-        <w:t xml:space="preserve">            </w:t>
-      </w:r>
-      <w:proofErr w:type="spellStart"/>
-      <w:r>
-        <w:t>isFavorite</w:t>
-      </w:r>
-      <w:proofErr w:type="spellEnd"/>
-      <w:r>
-        <w:t xml:space="preserve"> = false</w:t>
+        <w:t xml:space="preserve">            isFavorite = false</w:t>
       </w:r>
       <w:r>
         <w:br/>
@@ -9088,15 +7666,7 @@
       </w:r>
       <w:r>
         <w:br/>
-        <w:t xml:space="preserve">    </w:t>
-      </w:r>
-      <w:proofErr w:type="spellStart"/>
-      <w:r>
-        <w:t>val</w:t>
-      </w:r>
-      <w:proofErr w:type="spellEnd"/>
-      <w:r>
-        <w:t xml:space="preserve"> excursion = Excursion(</w:t>
+        <w:t xml:space="preserve">    val excursion = Excursion(</w:t>
       </w:r>
       <w:r>
         <w:br/>
@@ -9104,23 +7674,7 @@
       </w:r>
       <w:r>
         <w:br/>
-        <w:t xml:space="preserve">        </w:t>
-      </w:r>
-      <w:proofErr w:type="spellStart"/>
-      <w:r>
-        <w:t>vacationID</w:t>
-      </w:r>
-      <w:proofErr w:type="spellEnd"/>
-      <w:r>
-        <w:t xml:space="preserve"> = </w:t>
-      </w:r>
-      <w:proofErr w:type="spellStart"/>
-      <w:r>
-        <w:t>vacationId</w:t>
-      </w:r>
-      <w:proofErr w:type="spellEnd"/>
-      <w:r>
-        <w:t>,</w:t>
+        <w:t xml:space="preserve">        vacationID = vacationId,</w:t>
       </w:r>
       <w:r>
         <w:br/>
@@ -9150,55 +7704,22 @@
       </w:r>
       <w:r>
         <w:br/>
+        <w:t xml:space="preserve">    excursionDao.insert(excursion)</w:t>
+      </w:r>
+      <w:r>
+        <w:br/>
+      </w:r>
+      <w:r>
+        <w:br/>
+        <w:t xml:space="preserve">    val excursions = excursionDao.getExcursionsForVacation(vacationId).first()</w:t>
+      </w:r>
+      <w:r>
+        <w:br/>
+      </w:r>
+      <w:r>
+        <w:br/>
         <w:t xml:space="preserve">    </w:t>
       </w:r>
-      <w:proofErr w:type="spellStart"/>
-      <w:r>
-        <w:t>excursionDao.insert</w:t>
-      </w:r>
-      <w:proofErr w:type="spellEnd"/>
-      <w:r>
-        <w:t>(excursion)</w:t>
-      </w:r>
-      <w:r>
-        <w:br/>
-      </w:r>
-      <w:r>
-        <w:br/>
-        <w:t xml:space="preserve">    </w:t>
-      </w:r>
-      <w:proofErr w:type="spellStart"/>
-      <w:r>
-        <w:t>val</w:t>
-      </w:r>
-      <w:proofErr w:type="spellEnd"/>
-      <w:r>
-        <w:t xml:space="preserve"> excursions = </w:t>
-      </w:r>
-      <w:proofErr w:type="spellStart"/>
-      <w:r>
-        <w:t>excursionDao.getExcursionsForVacation</w:t>
-      </w:r>
-      <w:proofErr w:type="spellEnd"/>
-      <w:r>
-        <w:t>(</w:t>
-      </w:r>
-      <w:proofErr w:type="spellStart"/>
-      <w:r>
-        <w:t>vacationId</w:t>
-      </w:r>
-      <w:proofErr w:type="spellEnd"/>
-      <w:r>
-        <w:t>).first()</w:t>
-      </w:r>
-      <w:r>
-        <w:br/>
-      </w:r>
-      <w:r>
-        <w:br/>
-        <w:t xml:space="preserve">    </w:t>
-      </w:r>
-      <w:proofErr w:type="spellStart"/>
       <w:r>
         <w:rPr>
           <w:i/>
@@ -9206,23 +7727,13 @@
         </w:rPr>
         <w:t>assertEquals</w:t>
       </w:r>
-      <w:proofErr w:type="spellEnd"/>
-      <w:r>
-        <w:t xml:space="preserve">(1, </w:t>
-      </w:r>
-      <w:proofErr w:type="spellStart"/>
-      <w:r>
-        <w:t>excursions.size</w:t>
-      </w:r>
-      <w:proofErr w:type="spellEnd"/>
-      <w:r>
-        <w:t>)</w:t>
+      <w:r>
+        <w:t>(1, excursions.size)</w:t>
       </w:r>
       <w:r>
         <w:br/>
         <w:t xml:space="preserve">    </w:t>
       </w:r>
-      <w:proofErr w:type="spellStart"/>
       <w:r>
         <w:rPr>
           <w:i/>
@@ -9230,7 +7741,6 @@
         </w:rPr>
         <w:t>assertEquals</w:t>
       </w:r>
-      <w:proofErr w:type="spellEnd"/>
       <w:r>
         <w:t>("Wine Tasting", excursions[0].title)</w:t>
       </w:r>
@@ -9238,7 +7748,6 @@
         <w:br/>
         <w:t xml:space="preserve">    </w:t>
       </w:r>
-      <w:proofErr w:type="spellStart"/>
       <w:r>
         <w:rPr>
           <w:i/>
@@ -9246,25 +7755,8 @@
         </w:rPr>
         <w:t>assertEquals</w:t>
       </w:r>
-      <w:proofErr w:type="spellEnd"/>
-      <w:r>
-        <w:t>(</w:t>
-      </w:r>
-      <w:proofErr w:type="spellStart"/>
-      <w:r>
-        <w:t>vacationId</w:t>
-      </w:r>
-      <w:proofErr w:type="spellEnd"/>
-      <w:r>
-        <w:t>, excursions[0].</w:t>
-      </w:r>
-      <w:proofErr w:type="spellStart"/>
-      <w:r>
-        <w:t>vacationID</w:t>
-      </w:r>
-      <w:proofErr w:type="spellEnd"/>
-      <w:r>
-        <w:t>)</w:t>
+      <w:r>
+        <w:t>(vacationId, excursions[0].vacationID)</w:t>
       </w:r>
       <w:r>
         <w:br/>
@@ -9275,7 +7767,7 @@
       <w:pPr>
         <w:pStyle w:val="Heading2"/>
       </w:pPr>
-      <w:bookmarkStart w:id="42" w:name="_Toc233372525"/>
+      <w:bookmarkStart w:id="42" w:name="_Toc233652732"/>
       <w:r>
         <w:t>Test Script 5: Calculate Trip Financial Summary Test</w:t>
       </w:r>
@@ -9296,129 +7788,38 @@
       </w:r>
       <w:r>
         <w:br/>
-        <w:t xml:space="preserve">fun </w:t>
-      </w:r>
-      <w:proofErr w:type="spellStart"/>
-      <w:r>
-        <w:t>tripFinancialSummary_calculatesCorrectValues</w:t>
-      </w:r>
-      <w:proofErr w:type="spellEnd"/>
-      <w:r>
-        <w:t>(){</w:t>
+        <w:t>fun tripFinancialSummary_calculatesCorrectValues(){</w:t>
+      </w:r>
+      <w:r>
+        <w:br/>
+        <w:t xml:space="preserve">    val budget = 1000.0</w:t>
+      </w:r>
+      <w:r>
+        <w:br/>
+        <w:t xml:space="preserve">    val hotelCost = 300.0</w:t>
+      </w:r>
+      <w:r>
+        <w:br/>
+        <w:t xml:space="preserve">    val totalSpent = 200.0</w:t>
+      </w:r>
+      <w:r>
+        <w:br/>
+      </w:r>
+      <w:r>
+        <w:br/>
+        <w:t xml:space="preserve">    val totalTripCost = hotelCost + totalSpent</w:t>
+      </w:r>
+      <w:r>
+        <w:br/>
+        <w:t xml:space="preserve">    val remaining = budget - totalTripCost</w:t>
+      </w:r>
+      <w:r>
+        <w:br/>
       </w:r>
       <w:r>
         <w:br/>
         <w:t xml:space="preserve">    </w:t>
       </w:r>
-      <w:proofErr w:type="spellStart"/>
-      <w:r>
-        <w:t>val</w:t>
-      </w:r>
-      <w:proofErr w:type="spellEnd"/>
-      <w:r>
-        <w:t xml:space="preserve"> budget = 1000.0</w:t>
-      </w:r>
-      <w:r>
-        <w:br/>
-        <w:t xml:space="preserve">    </w:t>
-      </w:r>
-      <w:proofErr w:type="spellStart"/>
-      <w:r>
-        <w:t>val</w:t>
-      </w:r>
-      <w:proofErr w:type="spellEnd"/>
-      <w:r>
-        <w:t xml:space="preserve"> </w:t>
-      </w:r>
-      <w:proofErr w:type="spellStart"/>
-      <w:r>
-        <w:t>hotelCost</w:t>
-      </w:r>
-      <w:proofErr w:type="spellEnd"/>
-      <w:r>
-        <w:t xml:space="preserve"> = 300.0</w:t>
-      </w:r>
-      <w:r>
-        <w:br/>
-        <w:t xml:space="preserve">    </w:t>
-      </w:r>
-      <w:proofErr w:type="spellStart"/>
-      <w:r>
-        <w:t>val</w:t>
-      </w:r>
-      <w:proofErr w:type="spellEnd"/>
-      <w:r>
-        <w:t xml:space="preserve"> </w:t>
-      </w:r>
-      <w:proofErr w:type="spellStart"/>
-      <w:r>
-        <w:t>totalSpent</w:t>
-      </w:r>
-      <w:proofErr w:type="spellEnd"/>
-      <w:r>
-        <w:t xml:space="preserve"> = 200.0</w:t>
-      </w:r>
-      <w:r>
-        <w:br/>
-      </w:r>
-      <w:r>
-        <w:br/>
-        <w:t xml:space="preserve">    </w:t>
-      </w:r>
-      <w:proofErr w:type="spellStart"/>
-      <w:r>
-        <w:t>val</w:t>
-      </w:r>
-      <w:proofErr w:type="spellEnd"/>
-      <w:r>
-        <w:t xml:space="preserve"> </w:t>
-      </w:r>
-      <w:proofErr w:type="spellStart"/>
-      <w:r>
-        <w:t>totalTripCost</w:t>
-      </w:r>
-      <w:proofErr w:type="spellEnd"/>
-      <w:r>
-        <w:t xml:space="preserve"> = </w:t>
-      </w:r>
-      <w:proofErr w:type="spellStart"/>
-      <w:r>
-        <w:t>hotelCost</w:t>
-      </w:r>
-      <w:proofErr w:type="spellEnd"/>
-      <w:r>
-        <w:t xml:space="preserve"> + </w:t>
-      </w:r>
-      <w:proofErr w:type="spellStart"/>
-      <w:r>
-        <w:t>totalSpent</w:t>
-      </w:r>
-      <w:proofErr w:type="spellEnd"/>
-      <w:r>
-        <w:br/>
-        <w:t xml:space="preserve">    </w:t>
-      </w:r>
-      <w:proofErr w:type="spellStart"/>
-      <w:r>
-        <w:t>val</w:t>
-      </w:r>
-      <w:proofErr w:type="spellEnd"/>
-      <w:r>
-        <w:t xml:space="preserve"> remaining = budget - </w:t>
-      </w:r>
-      <w:proofErr w:type="spellStart"/>
-      <w:r>
-        <w:t>totalTripCost</w:t>
-      </w:r>
-      <w:proofErr w:type="spellEnd"/>
-      <w:r>
-        <w:br/>
-      </w:r>
-      <w:r>
-        <w:br/>
-        <w:t xml:space="preserve">    </w:t>
-      </w:r>
-      <w:proofErr w:type="spellStart"/>
       <w:r>
         <w:rPr>
           <w:i/>
@@ -9426,7 +7827,6 @@
         </w:rPr>
         <w:t>assertEquals</w:t>
       </w:r>
-      <w:proofErr w:type="spellEnd"/>
       <w:r>
         <w:t>(500.0, remaining, 0.001)</w:t>
       </w:r>
@@ -9434,7 +7834,6 @@
         <w:br/>
         <w:t xml:space="preserve">    </w:t>
       </w:r>
-      <w:proofErr w:type="spellStart"/>
       <w:r>
         <w:rPr>
           <w:i/>
@@ -9442,17 +7841,8 @@
         </w:rPr>
         <w:t>assertEquals</w:t>
       </w:r>
-      <w:proofErr w:type="spellEnd"/>
-      <w:r>
-        <w:t xml:space="preserve">(500.0, </w:t>
-      </w:r>
-      <w:proofErr w:type="spellStart"/>
-      <w:r>
-        <w:t>totalTripCost</w:t>
-      </w:r>
-      <w:proofErr w:type="spellEnd"/>
-      <w:r>
-        <w:t>, 0.001)</w:t>
+      <w:r>
+        <w:t>(500.0, totalTripCost, 0.001)</w:t>
       </w:r>
       <w:r>
         <w:br/>
@@ -9467,62 +7857,22 @@
       </w:r>
       <w:r>
         <w:br/>
-        <w:t xml:space="preserve">fun </w:t>
-      </w:r>
-      <w:proofErr w:type="spellStart"/>
-      <w:r>
-        <w:t>tripFinancialSummary_progressCalculation_isCorrect</w:t>
-      </w:r>
-      <w:proofErr w:type="spellEnd"/>
-      <w:r>
-        <w:t>(){</w:t>
-      </w:r>
-      <w:r>
-        <w:br/>
-        <w:t xml:space="preserve">    </w:t>
-      </w:r>
-      <w:proofErr w:type="spellStart"/>
-      <w:r>
-        <w:t>val</w:t>
-      </w:r>
-      <w:proofErr w:type="spellEnd"/>
-      <w:r>
-        <w:t xml:space="preserve"> budget = 1000.0</w:t>
-      </w:r>
-      <w:r>
-        <w:br/>
-        <w:t xml:space="preserve">    </w:t>
-      </w:r>
-      <w:proofErr w:type="spellStart"/>
-      <w:r>
-        <w:t>val</w:t>
-      </w:r>
-      <w:proofErr w:type="spellEnd"/>
-      <w:r>
-        <w:t xml:space="preserve"> </w:t>
-      </w:r>
-      <w:proofErr w:type="spellStart"/>
-      <w:r>
-        <w:t>totalSpent</w:t>
-      </w:r>
-      <w:proofErr w:type="spellEnd"/>
-      <w:r>
-        <w:t xml:space="preserve"> = 400.0</w:t>
-      </w:r>
-      <w:r>
-        <w:br/>
-      </w:r>
-      <w:r>
-        <w:br/>
-        <w:t xml:space="preserve">    </w:t>
-      </w:r>
-      <w:proofErr w:type="spellStart"/>
-      <w:r>
-        <w:t>val</w:t>
-      </w:r>
-      <w:proofErr w:type="spellEnd"/>
-      <w:r>
-        <w:t xml:space="preserve"> progress = when {</w:t>
+        <w:t>fun tripFinancialSummary_progressCalculation_isCorrect(){</w:t>
+      </w:r>
+      <w:r>
+        <w:br/>
+        <w:t xml:space="preserve">    val budget = 1000.0</w:t>
+      </w:r>
+      <w:r>
+        <w:br/>
+        <w:t xml:space="preserve">    val totalSpent = 400.0</w:t>
+      </w:r>
+      <w:r>
+        <w:br/>
+      </w:r>
+      <w:r>
+        <w:br/>
+        <w:t xml:space="preserve">    val progress = when {</w:t>
       </w:r>
       <w:r>
         <w:br/>
@@ -9530,47 +7880,15 @@
       </w:r>
       <w:r>
         <w:br/>
-        <w:t xml:space="preserve">        </w:t>
-      </w:r>
-      <w:proofErr w:type="spellStart"/>
-      <w:r>
-        <w:t>totalSpent</w:t>
-      </w:r>
-      <w:proofErr w:type="spellEnd"/>
-      <w:r>
-        <w:t xml:space="preserve"> &lt;= 0 -&gt; 0f</w:t>
-      </w:r>
-      <w:r>
-        <w:br/>
-        <w:t xml:space="preserve">        </w:t>
-      </w:r>
-      <w:proofErr w:type="spellStart"/>
-      <w:r>
-        <w:t>totalSpent</w:t>
-      </w:r>
-      <w:proofErr w:type="spellEnd"/>
-      <w:r>
-        <w:t xml:space="preserve"> &gt;= budget -&gt; 1f</w:t>
-      </w:r>
-      <w:r>
-        <w:br/>
-        <w:t xml:space="preserve">        else -&gt; (</w:t>
-      </w:r>
-      <w:proofErr w:type="spellStart"/>
-      <w:r>
-        <w:t>totalSpent</w:t>
-      </w:r>
-      <w:proofErr w:type="spellEnd"/>
-      <w:r>
-        <w:t>/budget).</w:t>
-      </w:r>
-      <w:proofErr w:type="spellStart"/>
-      <w:r>
-        <w:t>toFloat</w:t>
-      </w:r>
-      <w:proofErr w:type="spellEnd"/>
-      <w:r>
-        <w:t>()</w:t>
+        <w:t xml:space="preserve">        totalSpent &lt;= 0 -&gt; 0f</w:t>
+      </w:r>
+      <w:r>
+        <w:br/>
+        <w:t xml:space="preserve">        totalSpent &gt;= budget -&gt; 1f</w:t>
+      </w:r>
+      <w:r>
+        <w:br/>
+        <w:t xml:space="preserve">        else -&gt; (totalSpent/budget).toFloat()</w:t>
       </w:r>
       <w:r>
         <w:br/>
@@ -9583,7 +7901,6 @@
         <w:lastRenderedPageBreak/>
         <w:t xml:space="preserve">    </w:t>
       </w:r>
-      <w:proofErr w:type="spellStart"/>
       <w:r>
         <w:rPr>
           <w:i/>
@@ -9591,7 +7908,6 @@
         </w:rPr>
         <w:t>assertEquals</w:t>
       </w:r>
-      <w:proofErr w:type="spellEnd"/>
       <w:r>
         <w:t>(0.4f, progress)</w:t>
       </w:r>
@@ -9608,87 +7924,30 @@
       </w:r>
       <w:r>
         <w:br/>
-        <w:t xml:space="preserve">fun </w:t>
-      </w:r>
-      <w:proofErr w:type="spellStart"/>
-      <w:r>
-        <w:t>tripFinancialSummary_daysUntilTrip_isCorrect</w:t>
-      </w:r>
-      <w:proofErr w:type="spellEnd"/>
-      <w:r>
-        <w:t>(){</w:t>
+        <w:t>fun tripFinancialSummary_daysUntilTrip_isCorrect(){</w:t>
+      </w:r>
+      <w:r>
+        <w:br/>
+        <w:t xml:space="preserve">    val today = 100L</w:t>
+      </w:r>
+      <w:r>
+        <w:br/>
+        <w:t xml:space="preserve">    val tripStart = 110L</w:t>
+      </w:r>
+      <w:r>
+        <w:br/>
+      </w:r>
+      <w:r>
+        <w:br/>
+        <w:t xml:space="preserve">    val daysUntilTrip = tripStart - today</w:t>
+      </w:r>
+      <w:r>
+        <w:br/>
       </w:r>
       <w:r>
         <w:br/>
         <w:t xml:space="preserve">    </w:t>
       </w:r>
-      <w:proofErr w:type="spellStart"/>
-      <w:r>
-        <w:t>val</w:t>
-      </w:r>
-      <w:proofErr w:type="spellEnd"/>
-      <w:r>
-        <w:t xml:space="preserve"> today = 100L</w:t>
-      </w:r>
-      <w:r>
-        <w:br/>
-        <w:t xml:space="preserve">    </w:t>
-      </w:r>
-      <w:proofErr w:type="spellStart"/>
-      <w:r>
-        <w:t>val</w:t>
-      </w:r>
-      <w:proofErr w:type="spellEnd"/>
-      <w:r>
-        <w:t xml:space="preserve"> </w:t>
-      </w:r>
-      <w:proofErr w:type="spellStart"/>
-      <w:r>
-        <w:t>tripStart</w:t>
-      </w:r>
-      <w:proofErr w:type="spellEnd"/>
-      <w:r>
-        <w:t xml:space="preserve"> = 110L</w:t>
-      </w:r>
-      <w:r>
-        <w:br/>
-      </w:r>
-      <w:r>
-        <w:br/>
-        <w:t xml:space="preserve">    </w:t>
-      </w:r>
-      <w:proofErr w:type="spellStart"/>
-      <w:r>
-        <w:t>val</w:t>
-      </w:r>
-      <w:proofErr w:type="spellEnd"/>
-      <w:r>
-        <w:t xml:space="preserve"> </w:t>
-      </w:r>
-      <w:proofErr w:type="spellStart"/>
-      <w:r>
-        <w:t>daysUntilTrip</w:t>
-      </w:r>
-      <w:proofErr w:type="spellEnd"/>
-      <w:r>
-        <w:t xml:space="preserve"> = </w:t>
-      </w:r>
-      <w:proofErr w:type="spellStart"/>
-      <w:r>
-        <w:t>tripStart</w:t>
-      </w:r>
-      <w:proofErr w:type="spellEnd"/>
-      <w:r>
-        <w:t xml:space="preserve"> - today</w:t>
-      </w:r>
-      <w:r>
-        <w:br/>
-      </w:r>
-      <w:r>
-        <w:br/>
-        <w:t xml:space="preserve">    </w:t>
-      </w:r>
-      <w:proofErr w:type="spellStart"/>
       <w:r>
         <w:rPr>
           <w:i/>
@@ -9696,17 +7955,8 @@
         </w:rPr>
         <w:t>assertEquals</w:t>
       </w:r>
-      <w:proofErr w:type="spellEnd"/>
-      <w:r>
-        <w:t xml:space="preserve">(10L, </w:t>
-      </w:r>
-      <w:proofErr w:type="spellStart"/>
-      <w:r>
-        <w:t>daysUntilTrip</w:t>
-      </w:r>
-      <w:proofErr w:type="spellEnd"/>
-      <w:r>
-        <w:t>)</w:t>
+      <w:r>
+        <w:t>(10L, daysUntilTrip)</w:t>
       </w:r>
       <w:r>
         <w:br/>
@@ -9721,71 +7971,30 @@
       </w:r>
       <w:r>
         <w:br/>
-        <w:t xml:space="preserve">fun </w:t>
-      </w:r>
-      <w:proofErr w:type="spellStart"/>
-      <w:r>
-        <w:t>tripFinancialSummary_durationDays_isCorrect</w:t>
-      </w:r>
-      <w:proofErr w:type="spellEnd"/>
-      <w:r>
-        <w:t>(){</w:t>
+        <w:t>fun tripFinancialSummary_durationDays_isCorrect(){</w:t>
+      </w:r>
+      <w:r>
+        <w:br/>
+        <w:t xml:space="preserve">    val start = 100L</w:t>
+      </w:r>
+      <w:r>
+        <w:br/>
+        <w:t xml:space="preserve">    val end = 105L</w:t>
+      </w:r>
+      <w:r>
+        <w:br/>
+      </w:r>
+      <w:r>
+        <w:br/>
+        <w:t xml:space="preserve">    val durationDays = end - start</w:t>
+      </w:r>
+      <w:r>
+        <w:br/>
       </w:r>
       <w:r>
         <w:br/>
         <w:t xml:space="preserve">    </w:t>
       </w:r>
-      <w:proofErr w:type="spellStart"/>
-      <w:r>
-        <w:t>val</w:t>
-      </w:r>
-      <w:proofErr w:type="spellEnd"/>
-      <w:r>
-        <w:t xml:space="preserve"> start = 100L</w:t>
-      </w:r>
-      <w:r>
-        <w:br/>
-        <w:t xml:space="preserve">    </w:t>
-      </w:r>
-      <w:proofErr w:type="spellStart"/>
-      <w:r>
-        <w:t>val</w:t>
-      </w:r>
-      <w:proofErr w:type="spellEnd"/>
-      <w:r>
-        <w:t xml:space="preserve"> end = 105L</w:t>
-      </w:r>
-      <w:r>
-        <w:br/>
-      </w:r>
-      <w:r>
-        <w:br/>
-        <w:t xml:space="preserve">    </w:t>
-      </w:r>
-      <w:proofErr w:type="spellStart"/>
-      <w:r>
-        <w:t>val</w:t>
-      </w:r>
-      <w:proofErr w:type="spellEnd"/>
-      <w:r>
-        <w:t xml:space="preserve"> </w:t>
-      </w:r>
-      <w:proofErr w:type="spellStart"/>
-      <w:r>
-        <w:t>durationDays</w:t>
-      </w:r>
-      <w:proofErr w:type="spellEnd"/>
-      <w:r>
-        <w:t xml:space="preserve"> = end - start</w:t>
-      </w:r>
-      <w:r>
-        <w:br/>
-      </w:r>
-      <w:r>
-        <w:br/>
-        <w:t xml:space="preserve">    </w:t>
-      </w:r>
-      <w:proofErr w:type="spellStart"/>
       <w:r>
         <w:rPr>
           <w:i/>
@@ -9793,17 +8002,8 @@
         </w:rPr>
         <w:t>assertEquals</w:t>
       </w:r>
-      <w:proofErr w:type="spellEnd"/>
-      <w:r>
-        <w:t xml:space="preserve">(5L, </w:t>
-      </w:r>
-      <w:proofErr w:type="spellStart"/>
-      <w:r>
-        <w:t>durationDays</w:t>
-      </w:r>
-      <w:proofErr w:type="spellEnd"/>
-      <w:r>
-        <w:t>)</w:t>
+      <w:r>
+        <w:t>(5L, durationDays)</w:t>
       </w:r>
       <w:r>
         <w:br/>
@@ -9814,7 +8014,7 @@
       <w:pPr>
         <w:pStyle w:val="Heading1"/>
       </w:pPr>
-      <w:bookmarkStart w:id="43" w:name="_Toc233372526"/>
+      <w:bookmarkStart w:id="43" w:name="_Toc233652733"/>
       <w:r>
         <w:t>Unit Test Results</w:t>
       </w:r>
@@ -9829,7 +8029,7 @@
       <w:pPr>
         <w:pStyle w:val="Heading2"/>
       </w:pPr>
-      <w:bookmarkStart w:id="44" w:name="_Toc233372527"/>
+      <w:bookmarkStart w:id="44" w:name="_Toc233652734"/>
       <w:r>
         <w:lastRenderedPageBreak/>
         <w:t>Insert Vacation Test – Passed</w:t>
@@ -9882,7 +8082,7 @@
       <w:pPr>
         <w:pStyle w:val="Heading2"/>
       </w:pPr>
-      <w:bookmarkStart w:id="45" w:name="_Toc233372528"/>
+      <w:bookmarkStart w:id="45" w:name="_Toc233652735"/>
       <w:r>
         <w:lastRenderedPageBreak/>
         <w:t>Prevent Invalid Budget Input Test – Passed</w:t>
@@ -9935,7 +8135,7 @@
       <w:pPr>
         <w:pStyle w:val="Heading2"/>
       </w:pPr>
-      <w:bookmarkStart w:id="46" w:name="_Toc233372529"/>
+      <w:bookmarkStart w:id="46" w:name="_Toc233652736"/>
       <w:r>
         <w:lastRenderedPageBreak/>
         <w:t>Delete Vacation Test – Passed</w:t>
@@ -9988,7 +8188,7 @@
       <w:pPr>
         <w:pStyle w:val="Heading2"/>
       </w:pPr>
-      <w:bookmarkStart w:id="47" w:name="_Toc233372530"/>
+      <w:bookmarkStart w:id="47" w:name="_Toc233652737"/>
       <w:r>
         <w:lastRenderedPageBreak/>
         <w:t>Add Excursion Test – Passed</w:t>
@@ -10041,7 +8241,7 @@
       <w:pPr>
         <w:pStyle w:val="Heading2"/>
       </w:pPr>
-      <w:bookmarkStart w:id="48" w:name="_Toc233372531"/>
+      <w:bookmarkStart w:id="48" w:name="_Toc233652738"/>
       <w:r>
         <w:lastRenderedPageBreak/>
         <w:t>Calculate Trip Financial Summary Test – Passed</w:t>
@@ -10101,31 +8301,15 @@
       <w:pPr>
         <w:pStyle w:val="Heading1"/>
       </w:pPr>
-      <w:bookmarkStart w:id="49" w:name="_Toc233372532"/>
-      <w:r>
-        <w:t xml:space="preserve">Summary of Changes </w:t>
-      </w:r>
-      <w:proofErr w:type="gramStart"/>
-      <w:r>
-        <w:t>From</w:t>
-      </w:r>
-      <w:proofErr w:type="gramEnd"/>
-      <w:r>
-        <w:t xml:space="preserve"> Testing</w:t>
+      <w:bookmarkStart w:id="49" w:name="_Toc233652739"/>
+      <w:r>
+        <w:t>Summary of Changes From Testing</w:t>
       </w:r>
       <w:bookmarkEnd w:id="49"/>
     </w:p>
     <w:p>
       <w:r>
-        <w:t xml:space="preserve">All five tests passed successfully on the first execution. No code changes were required </w:t>
-      </w:r>
-      <w:proofErr w:type="gramStart"/>
-      <w:r>
-        <w:t>as a result of</w:t>
-      </w:r>
-      <w:proofErr w:type="gramEnd"/>
-      <w:r>
-        <w:t xml:space="preserve"> testing. The tests confirmed that:</w:t>
+        <w:t>All five tests passed successfully on the first execution. No code changes were required as a result of testing. The tests confirmed that:</w:t>
       </w:r>
     </w:p>
     <w:p>

</xml_diff>

<commit_message>
fixed minor issue with the gitlab section in the Vacation Planner Application.docx
</commit_message>
<xml_diff>
--- a/documentation/Vacation Planner Application.docx
+++ b/documentation/Vacation Planner Application.docx
@@ -3939,7 +3939,7 @@
         <w:t xml:space="preserve">Commit Hash for Submitted Version: </w:t>
       </w:r>
       <w:r>
-        <w:t>def1b8d95e205d5fe55e8e0b004413d2121ef6bf</w:t>
+        <w:t>7695cb1f212bab6638c345fe7f06f3024c2b3b73</w:t>
       </w:r>
     </w:p>
     <w:p/>
@@ -5749,6 +5749,9 @@
     </w:p>
     <w:p>
       <w:r>
+        <w:rPr>
+          <w:noProof/>
+        </w:rPr>
         <w:drawing>
           <wp:inline distT="0" distB="0" distL="0" distR="0" wp14:anchorId="304873E4" wp14:editId="264C0B70">
             <wp:extent cx="3215919" cy="7011008"/>
@@ -6067,6 +6070,9 @@
     </w:p>
     <w:p>
       <w:r>
+        <w:rPr>
+          <w:noProof/>
+        </w:rPr>
         <w:lastRenderedPageBreak/>
         <w:drawing>
           <wp:inline distT="0" distB="0" distL="0" distR="0" wp14:anchorId="1E21A6A9" wp14:editId="78A7ABFD">
@@ -6107,6 +6113,9 @@
     </w:p>
     <w:p>
       <w:r>
+        <w:rPr>
+          <w:noProof/>
+        </w:rPr>
         <w:lastRenderedPageBreak/>
         <w:drawing>
           <wp:inline distT="0" distB="0" distL="0" distR="0" wp14:anchorId="2FA8EFAA" wp14:editId="194E1D3D">

</xml_diff>